<commit_message>
Ch6 students interviews draft
</commit_message>
<xml_diff>
--- a/Draft/Extra Sections.docx
+++ b/Draft/Extra Sections.docx
@@ -1,10 +1,10 @@
 
 <file path=word/document.xml><?xml version="1.0" encoding="utf-8"?>
-<w:document xmlns:wpc="http://schemas.microsoft.com/office/word/2010/wordprocessingCanvas" xmlns:cx="http://schemas.microsoft.com/office/drawing/2014/chartex" xmlns:cx1="http://schemas.microsoft.com/office/drawing/2015/9/8/chartex" xmlns:cx2="http://schemas.microsoft.com/office/drawing/2015/10/21/chartex" xmlns:cx3="http://schemas.microsoft.com/office/drawing/2016/5/9/chartex" xmlns:cx4="http://schemas.microsoft.com/office/drawing/2016/5/10/chartex" xmlns:cx5="http://schemas.microsoft.com/office/drawing/2016/5/11/chartex" xmlns:cx6="http://schemas.microsoft.com/office/drawing/2016/5/12/chartex" xmlns:cx7="http://schemas.microsoft.com/office/drawing/2016/5/13/chartex" xmlns:cx8="http://schemas.microsoft.com/office/drawing/2016/5/14/chartex" xmlns:mc="http://schemas.openxmlformats.org/markup-compatibility/2006" xmlns:aink="http://schemas.microsoft.com/office/drawing/2016/ink" xmlns:am3d="http://schemas.microsoft.com/office/drawing/2017/model3d" xmlns:o="urn:schemas-microsoft-com:office:office" xmlns:oel="http://schemas.microsoft.com/office/2019/extlst" xmlns:r="http://schemas.openxmlformats.org/officeDocument/2006/relationships" xmlns:m="http://schemas.openxmlformats.org/officeDocument/2006/math" xmlns:v="urn:schemas-microsoft-com:vml" xmlns:wp14="http://schemas.microsoft.com/office/word/2010/wordprocessingDrawing" xmlns:wp="http://schemas.openxmlformats.org/drawingml/2006/wordprocessingDrawing" xmlns:w10="urn:schemas-microsoft-com:office:word" xmlns:w="http://schemas.openxmlformats.org/wordprocessingml/2006/main" xmlns:w14="http://schemas.microsoft.com/office/word/2010/wordml" xmlns:w15="http://schemas.microsoft.com/office/word/2012/wordml" xmlns:w16cex="http://schemas.microsoft.com/office/word/2018/wordml/cex" xmlns:w16cid="http://schemas.microsoft.com/office/word/2016/wordml/cid" xmlns:w16="http://schemas.microsoft.com/office/word/2018/wordml" xmlns:w16du="http://schemas.microsoft.com/office/word/2023/wordml/word16du" xmlns:w16sdtdh="http://schemas.microsoft.com/office/word/2020/wordml/sdtdatahash" xmlns:w16sdtfl="http://schemas.microsoft.com/office/word/2024/wordml/sdtformatlock" xmlns:w16se="http://schemas.microsoft.com/office/word/2015/wordml/symex" xmlns:wpg="http://schemas.microsoft.com/office/word/2010/wordprocessingGroup" xmlns:wpi="http://schemas.microsoft.com/office/word/2010/wordprocessingInk" xmlns:wne="http://schemas.microsoft.com/office/word/2006/wordml" xmlns:wps="http://schemas.microsoft.com/office/word/2010/wordprocessingShape" mc:Ignorable="w14 w15 w16se w16cid w16 w16cex w16sdtdh w16sdtfl w16du wp14">
+<w:document xmlns:wpc="http://schemas.microsoft.com/office/word/2010/wordprocessingCanvas" xmlns:cx="http://schemas.microsoft.com/office/drawing/2014/chartex" xmlns:cx1="http://schemas.microsoft.com/office/drawing/2015/9/8/chartex" xmlns:cx2="http://schemas.microsoft.com/office/drawing/2015/10/21/chartex" xmlns:cx3="http://schemas.microsoft.com/office/drawing/2016/5/9/chartex" xmlns:cx4="http://schemas.microsoft.com/office/drawing/2016/5/10/chartex" xmlns:cx5="http://schemas.microsoft.com/office/drawing/2016/5/11/chartex" xmlns:cx6="http://schemas.microsoft.com/office/drawing/2016/5/12/chartex" xmlns:cx7="http://schemas.microsoft.com/office/drawing/2016/5/13/chartex" xmlns:cx8="http://schemas.microsoft.com/office/drawing/2016/5/14/chartex" xmlns:mc="http://schemas.openxmlformats.org/markup-compatibility/2006" xmlns:aink="http://schemas.microsoft.com/office/drawing/2016/ink" xmlns:am3d="http://schemas.microsoft.com/office/drawing/2017/model3d" xmlns:o="urn:schemas-microsoft-com:office:office" xmlns:r="http://schemas.openxmlformats.org/officeDocument/2006/relationships" xmlns:m="http://schemas.openxmlformats.org/officeDocument/2006/math" xmlns:v="urn:schemas-microsoft-com:vml" xmlns:wp14="http://schemas.microsoft.com/office/word/2010/wordprocessingDrawing" xmlns:wp="http://schemas.openxmlformats.org/drawingml/2006/wordprocessingDrawing" xmlns:w10="urn:schemas-microsoft-com:office:word" xmlns:w="http://schemas.openxmlformats.org/wordprocessingml/2006/main" xmlns:w14="http://schemas.microsoft.com/office/word/2010/wordml" xmlns:w15="http://schemas.microsoft.com/office/word/2012/wordml" xmlns:w16cex="http://schemas.microsoft.com/office/word/2018/wordml/cex" xmlns:w16cid="http://schemas.microsoft.com/office/word/2016/wordml/cid" xmlns:w16="http://schemas.microsoft.com/office/word/2018/wordml" xmlns:w16sdtdh="http://schemas.microsoft.com/office/word/2020/wordml/sdtdatahash" xmlns:w16se="http://schemas.microsoft.com/office/word/2015/wordml/symex" xmlns:wpg="http://schemas.microsoft.com/office/word/2010/wordprocessingGroup" xmlns:wpi="http://schemas.microsoft.com/office/word/2010/wordprocessingInk" xmlns:wne="http://schemas.microsoft.com/office/word/2006/wordml" xmlns:wps="http://schemas.microsoft.com/office/word/2010/wordprocessingShape" mc:Ignorable="w14 w15 w16se w16cid w16 w16cex w16sdtdh wp14">
   <w:body>
     <w:p>
       <w:pPr>
-        <w:pStyle w:val="Ttulo1"/>
+        <w:pStyle w:val="Heading1"/>
         <w:rPr>
           <w:lang w:val="en-NZ"/>
         </w:rPr>
@@ -31,7 +31,7 @@
     </w:p>
     <w:p>
       <w:pPr>
-        <w:pStyle w:val="Ttulo1"/>
+        <w:pStyle w:val="Heading1"/>
         <w:rPr>
           <w:lang w:val="en-NZ"/>
         </w:rPr>
@@ -45,7 +45,746 @@
     </w:p>
     <w:p>
       <w:pPr>
-        <w:pStyle w:val="Ttulo1"/>
+        <w:rPr>
+          <w:lang w:val="en-NZ"/>
+        </w:rPr>
+      </w:pPr>
+      <w:r>
+        <w:rPr>
+          <w:lang w:val="en-NZ"/>
+        </w:rPr>
+        <w:t xml:space="preserve">This research project is an exploration of the use of Augmented Reality for </w:t>
+      </w:r>
+      <w:r>
+        <w:rPr>
+          <w:lang w:val="en-NZ"/>
+        </w:rPr>
+        <w:t>C</w:t>
+      </w:r>
+      <w:r>
+        <w:rPr>
+          <w:lang w:val="en-NZ"/>
+        </w:rPr>
+        <w:t xml:space="preserve">ollaborative </w:t>
+      </w:r>
+      <w:r>
+        <w:rPr>
+          <w:lang w:val="en-NZ"/>
+        </w:rPr>
+        <w:t>L</w:t>
+      </w:r>
+      <w:r>
+        <w:rPr>
+          <w:lang w:val="en-NZ"/>
+        </w:rPr>
+        <w:t>earning</w:t>
+      </w:r>
+      <w:r>
+        <w:rPr>
+          <w:lang w:val="en-NZ"/>
+        </w:rPr>
+        <w:t xml:space="preserve">. </w:t>
+      </w:r>
+      <w:r>
+        <w:rPr>
+          <w:lang w:val="en-NZ"/>
+        </w:rPr>
+        <w:t>C</w:t>
+      </w:r>
+      <w:r>
+        <w:rPr>
+          <w:lang w:val="en-NZ"/>
+        </w:rPr>
+        <w:t xml:space="preserve">urrent literature shows a growing interest </w:t>
+      </w:r>
+      <w:r>
+        <w:rPr>
+          <w:lang w:val="en-NZ"/>
+        </w:rPr>
+        <w:t>in the</w:t>
+      </w:r>
+      <w:r>
+        <w:rPr>
+          <w:lang w:val="en-NZ"/>
+        </w:rPr>
+        <w:t xml:space="preserve"> use</w:t>
+      </w:r>
+      <w:r>
+        <w:rPr>
+          <w:lang w:val="en-NZ"/>
+        </w:rPr>
+        <w:t xml:space="preserve"> of</w:t>
+      </w:r>
+      <w:r>
+        <w:rPr>
+          <w:lang w:val="en-NZ"/>
+        </w:rPr>
+        <w:t xml:space="preserve"> interactive technologies for teaching and the overall impact of Technology Enhanced Learning projects experimenting with the implementation of AR. This technology offers interesting visualisation tools to merge digital information with the physical context of the user, creating unique interactive experiences and boosting engagement for the students, but it had been tested mostly on single-user settings.</w:t>
+      </w:r>
+    </w:p>
+    <w:p>
+      <w:pPr>
+        <w:rPr>
+          <w:lang w:val="en-NZ"/>
+        </w:rPr>
+      </w:pPr>
+      <w:r>
+        <w:rPr>
+          <w:lang w:val="en-NZ"/>
+        </w:rPr>
+        <w:t xml:space="preserve">The proposal of this thesis is that the unique visualisation capabilities of AR and the connectivity offered by the mobile </w:t>
+      </w:r>
+      <w:r>
+        <w:rPr>
+          <w:lang w:val="en-NZ"/>
+        </w:rPr>
+        <w:t>hardware</w:t>
+      </w:r>
+      <w:r>
+        <w:rPr>
+          <w:lang w:val="en-NZ"/>
+        </w:rPr>
+        <w:t xml:space="preserve"> often</w:t>
+      </w:r>
+      <w:r>
+        <w:rPr>
+          <w:lang w:val="en-NZ"/>
+        </w:rPr>
+        <w:t xml:space="preserve"> use</w:t>
+      </w:r>
+      <w:r>
+        <w:rPr>
+          <w:lang w:val="en-NZ"/>
+        </w:rPr>
+        <w:t>d</w:t>
+      </w:r>
+      <w:r>
+        <w:rPr>
+          <w:lang w:val="en-NZ"/>
+        </w:rPr>
+        <w:t xml:space="preserve"> </w:t>
+      </w:r>
+      <w:r>
+        <w:rPr>
+          <w:lang w:val="en-NZ"/>
+        </w:rPr>
+        <w:t xml:space="preserve">for </w:t>
+      </w:r>
+      <w:r>
+        <w:rPr>
+          <w:lang w:val="en-NZ"/>
+        </w:rPr>
+        <w:t xml:space="preserve">its </w:t>
+      </w:r>
+      <w:r>
+        <w:rPr>
+          <w:lang w:val="en-NZ"/>
+        </w:rPr>
+        <w:t>deployment</w:t>
+      </w:r>
+      <w:r>
+        <w:rPr>
+          <w:lang w:val="en-NZ"/>
+        </w:rPr>
+        <w:t xml:space="preserve"> can</w:t>
+      </w:r>
+      <w:r>
+        <w:rPr>
+          <w:lang w:val="en-NZ"/>
+        </w:rPr>
+        <w:t xml:space="preserve"> </w:t>
+      </w:r>
+      <w:r>
+        <w:rPr>
+          <w:lang w:val="en-NZ"/>
+        </w:rPr>
+        <w:t>provide</w:t>
+      </w:r>
+      <w:r>
+        <w:rPr>
+          <w:lang w:val="en-NZ"/>
+        </w:rPr>
+        <w:t xml:space="preserve"> an advantage</w:t>
+      </w:r>
+      <w:r>
+        <w:rPr>
+          <w:lang w:val="en-NZ"/>
+        </w:rPr>
+        <w:t xml:space="preserve"> </w:t>
+      </w:r>
+      <w:r>
+        <w:rPr>
+          <w:lang w:val="en-NZ"/>
+        </w:rPr>
+        <w:t>for</w:t>
+      </w:r>
+      <w:r>
+        <w:rPr>
+          <w:lang w:val="en-NZ"/>
+        </w:rPr>
+        <w:t xml:space="preserve"> effective </w:t>
+      </w:r>
+      <w:r>
+        <w:rPr>
+          <w:lang w:val="en-NZ"/>
+        </w:rPr>
+        <w:t>C</w:t>
+      </w:r>
+      <w:r>
+        <w:rPr>
+          <w:lang w:val="en-NZ"/>
+        </w:rPr>
+        <w:t>ollaborat</w:t>
+      </w:r>
+      <w:r>
+        <w:rPr>
+          <w:lang w:val="en-NZ"/>
+        </w:rPr>
+        <w:t>ive</w:t>
+      </w:r>
+      <w:r>
+        <w:rPr>
+          <w:lang w:val="en-NZ"/>
+        </w:rPr>
+        <w:t xml:space="preserve"> </w:t>
+      </w:r>
+      <w:r>
+        <w:rPr>
+          <w:lang w:val="en-NZ"/>
+        </w:rPr>
+        <w:t>L</w:t>
+      </w:r>
+      <w:r>
+        <w:rPr>
+          <w:lang w:val="en-NZ"/>
+        </w:rPr>
+        <w:t>earning</w:t>
+      </w:r>
+      <w:r>
+        <w:rPr>
+          <w:lang w:val="en-NZ"/>
+        </w:rPr>
+        <w:t xml:space="preserve">. For this purpose, </w:t>
+      </w:r>
+      <w:r>
+        <w:rPr>
+          <w:lang w:val="en-NZ"/>
+        </w:rPr>
+        <w:t>WorkshopAR</w:t>
+      </w:r>
+      <w:r>
+        <w:rPr>
+          <w:lang w:val="en-NZ"/>
+        </w:rPr>
+        <w:t xml:space="preserve"> was developed following a user-centred design and implemented </w:t>
+      </w:r>
+      <w:r>
+        <w:rPr>
+          <w:lang w:val="en-NZ"/>
+        </w:rPr>
+        <w:t>within the context</w:t>
+      </w:r>
+      <w:r>
+        <w:rPr>
+          <w:lang w:val="en-NZ"/>
+        </w:rPr>
+        <w:t xml:space="preserve"> of a </w:t>
+      </w:r>
+      <w:r>
+        <w:rPr>
+          <w:lang w:val="en-NZ"/>
+        </w:rPr>
+        <w:t>project-based</w:t>
+      </w:r>
+      <w:r>
+        <w:rPr>
+          <w:lang w:val="en-NZ"/>
+        </w:rPr>
+        <w:t xml:space="preserve"> course in construction design.</w:t>
+      </w:r>
+      <w:r>
+        <w:rPr>
+          <w:lang w:val="en-NZ"/>
+        </w:rPr>
+        <w:t xml:space="preserve"> </w:t>
+      </w:r>
+      <w:r>
+        <w:rPr>
+          <w:lang w:val="en-NZ"/>
+        </w:rPr>
+        <w:t>This application</w:t>
+      </w:r>
+      <w:r>
+        <w:rPr>
+          <w:lang w:val="en-NZ"/>
+        </w:rPr>
+        <w:t xml:space="preserve"> offer</w:t>
+      </w:r>
+      <w:r>
+        <w:rPr>
+          <w:lang w:val="en-NZ"/>
+        </w:rPr>
+        <w:t>s</w:t>
+      </w:r>
+      <w:r>
+        <w:rPr>
+          <w:lang w:val="en-NZ"/>
+        </w:rPr>
+        <w:t xml:space="preserve"> </w:t>
+      </w:r>
+      <w:r>
+        <w:rPr>
+          <w:lang w:val="en-NZ"/>
+        </w:rPr>
+        <w:t xml:space="preserve">the </w:t>
+      </w:r>
+      <w:r>
+        <w:rPr>
+          <w:lang w:val="en-NZ"/>
+        </w:rPr>
+        <w:t xml:space="preserve">students different tools </w:t>
+      </w:r>
+      <w:r>
+        <w:rPr>
+          <w:lang w:val="en-NZ"/>
+        </w:rPr>
+        <w:t>to</w:t>
+      </w:r>
+      <w:r>
+        <w:rPr>
+          <w:lang w:val="en-NZ"/>
+        </w:rPr>
+        <w:t xml:space="preserve"> help them</w:t>
+      </w:r>
+      <w:r>
+        <w:rPr>
+          <w:lang w:val="en-NZ"/>
+        </w:rPr>
+        <w:t xml:space="preserve"> </w:t>
+      </w:r>
+      <w:r>
+        <w:rPr>
+          <w:lang w:val="en-NZ"/>
+        </w:rPr>
+        <w:t>structure and manage their collaborative work.</w:t>
+      </w:r>
+    </w:p>
+    <w:p>
+      <w:pPr>
+        <w:rPr>
+          <w:lang w:val="en-NZ"/>
+        </w:rPr>
+      </w:pPr>
+      <w:r>
+        <w:rPr>
+          <w:lang w:val="en-NZ"/>
+        </w:rPr>
+        <w:t xml:space="preserve">The </w:t>
+      </w:r>
+      <w:r>
+        <w:rPr>
+          <w:lang w:val="en-NZ"/>
+        </w:rPr>
+        <w:t>I</w:t>
+      </w:r>
+      <w:r>
+        <w:rPr>
+          <w:lang w:val="en-NZ"/>
+        </w:rPr>
+        <w:t>ndustry Project course was used as a case study</w:t>
+      </w:r>
+      <w:r>
+        <w:rPr>
+          <w:lang w:val="en-NZ"/>
+        </w:rPr>
+        <w:t xml:space="preserve"> to observe the impact that the introduction of WorkshopAR produced in the behaviour of the students </w:t>
+      </w:r>
+      <w:r>
+        <w:rPr>
+          <w:lang w:val="en-NZ"/>
+        </w:rPr>
+        <w:t xml:space="preserve">during </w:t>
+      </w:r>
+      <w:r>
+        <w:rPr>
+          <w:lang w:val="en-NZ"/>
+        </w:rPr>
+        <w:t>their classroom activities. The main objective was to promote positive</w:t>
+      </w:r>
+      <w:r>
+        <w:rPr>
+          <w:lang w:val="en-NZ"/>
+        </w:rPr>
+        <w:t xml:space="preserve"> changes</w:t>
+      </w:r>
+      <w:r>
+        <w:rPr>
+          <w:lang w:val="en-NZ"/>
+        </w:rPr>
+        <w:t xml:space="preserve"> through the application, helping the students develop </w:t>
+      </w:r>
+      <w:r>
+        <w:rPr>
+          <w:lang w:val="en-NZ"/>
+        </w:rPr>
+        <w:t>and apply</w:t>
+      </w:r>
+      <w:r>
+        <w:rPr>
+          <w:lang w:val="en-NZ"/>
+        </w:rPr>
+        <w:t xml:space="preserve"> important skills for effective collaboration and for a successful development of their project. </w:t>
+      </w:r>
+      <w:r>
+        <w:rPr>
+          <w:lang w:val="en-NZ"/>
+        </w:rPr>
+        <w:t xml:space="preserve">The risks and uncertainties of such a strong intervention with technology in social, collaborative activities were also taken into consideration, and the observation process </w:t>
+      </w:r>
+      <w:r>
+        <w:rPr>
+          <w:lang w:val="en-NZ"/>
+        </w:rPr>
+        <w:t>also</w:t>
+      </w:r>
+      <w:r>
+        <w:rPr>
+          <w:lang w:val="en-NZ"/>
+        </w:rPr>
+        <w:t xml:space="preserve"> </w:t>
+      </w:r>
+      <w:r>
+        <w:rPr>
+          <w:lang w:val="en-NZ"/>
+        </w:rPr>
+        <w:t>identified</w:t>
+      </w:r>
+      <w:r>
+        <w:rPr>
+          <w:lang w:val="en-NZ"/>
+        </w:rPr>
+        <w:t xml:space="preserve"> negative or undesirable changes in behaviour that could be acknowledged through the iterative</w:t>
+      </w:r>
+      <w:r>
+        <w:rPr>
+          <w:lang w:val="en-NZ"/>
+        </w:rPr>
+        <w:t xml:space="preserve"> development</w:t>
+      </w:r>
+      <w:r>
+        <w:rPr>
+          <w:lang w:val="en-NZ"/>
+        </w:rPr>
+        <w:t xml:space="preserve"> </w:t>
+      </w:r>
+      <w:r>
+        <w:rPr>
+          <w:lang w:val="en-NZ"/>
+        </w:rPr>
+        <w:t>process</w:t>
+      </w:r>
+      <w:r>
+        <w:rPr>
+          <w:lang w:val="en-NZ"/>
+        </w:rPr>
+        <w:t xml:space="preserve"> </w:t>
+      </w:r>
+      <w:r>
+        <w:rPr>
+          <w:lang w:val="en-NZ"/>
+        </w:rPr>
+        <w:t>used</w:t>
+      </w:r>
+      <w:r>
+        <w:rPr>
+          <w:lang w:val="en-NZ"/>
+        </w:rPr>
+        <w:t>.</w:t>
+      </w:r>
+    </w:p>
+    <w:p>
+      <w:pPr>
+        <w:rPr>
+          <w:lang w:val="en-NZ"/>
+        </w:rPr>
+      </w:pPr>
+      <w:r>
+        <w:rPr>
+          <w:lang w:val="en-NZ"/>
+        </w:rPr>
+        <w:t xml:space="preserve">The case study also offered an </w:t>
+      </w:r>
+      <w:r>
+        <w:rPr>
+          <w:lang w:val="en-NZ"/>
+        </w:rPr>
+        <w:t>opportunity to document the design and implementation of the software</w:t>
+      </w:r>
+      <w:r>
+        <w:rPr>
+          <w:lang w:val="en-NZ"/>
+        </w:rPr>
+        <w:t>. T</w:t>
+      </w:r>
+      <w:r>
+        <w:rPr>
+          <w:lang w:val="en-NZ"/>
+        </w:rPr>
+        <w:t xml:space="preserve">he </w:t>
+      </w:r>
+      <w:r>
+        <w:rPr>
+          <w:lang w:val="en-NZ"/>
+        </w:rPr>
+        <w:t>development process</w:t>
+      </w:r>
+      <w:r>
+        <w:rPr>
+          <w:lang w:val="en-NZ"/>
+        </w:rPr>
+        <w:t xml:space="preserve"> </w:t>
+      </w:r>
+      <w:r>
+        <w:rPr>
+          <w:lang w:val="en-NZ"/>
+        </w:rPr>
+        <w:t>integrated</w:t>
+      </w:r>
+      <w:r>
+        <w:rPr>
+          <w:lang w:val="en-NZ"/>
+        </w:rPr>
+        <w:t xml:space="preserve"> the </w:t>
+      </w:r>
+      <w:r>
+        <w:rPr>
+          <w:lang w:val="en-NZ"/>
+        </w:rPr>
+        <w:t xml:space="preserve">functional requirements of </w:t>
+      </w:r>
+      <w:r>
+        <w:rPr>
+          <w:lang w:val="en-NZ"/>
+        </w:rPr>
+        <w:t>the tool with the learning goals of the course and tie</w:t>
+      </w:r>
+      <w:r>
+        <w:rPr>
+          <w:lang w:val="en-NZ"/>
+        </w:rPr>
+        <w:t>d</w:t>
+      </w:r>
+      <w:r>
+        <w:rPr>
+          <w:lang w:val="en-NZ"/>
+        </w:rPr>
+        <w:t xml:space="preserve"> the iterative </w:t>
+      </w:r>
+      <w:r>
+        <w:rPr>
+          <w:lang w:val="en-NZ"/>
+        </w:rPr>
+        <w:t xml:space="preserve">development </w:t>
+      </w:r>
+      <w:r>
+        <w:rPr>
+          <w:lang w:val="en-NZ"/>
+        </w:rPr>
+        <w:t xml:space="preserve">with </w:t>
+      </w:r>
+      <w:r>
+        <w:rPr>
+          <w:lang w:val="en-NZ"/>
+        </w:rPr>
+        <w:t>what was</w:t>
+      </w:r>
+      <w:r>
+        <w:rPr>
+          <w:lang w:val="en-NZ"/>
+        </w:rPr>
+        <w:t xml:space="preserve"> observed in the classroom.</w:t>
+      </w:r>
+      <w:r>
+        <w:rPr>
+          <w:lang w:val="en-NZ"/>
+        </w:rPr>
+        <w:t xml:space="preserve"> This allowed a flexible </w:t>
+      </w:r>
+      <w:r>
+        <w:rPr>
+          <w:lang w:val="en-NZ"/>
+        </w:rPr>
+        <w:t xml:space="preserve">and adaptable </w:t>
+      </w:r>
+      <w:r>
+        <w:rPr>
+          <w:lang w:val="en-NZ"/>
+        </w:rPr>
+        <w:t>design that boost</w:t>
+      </w:r>
+      <w:r>
+        <w:rPr>
+          <w:lang w:val="en-NZ"/>
+        </w:rPr>
+        <w:t>ed</w:t>
+      </w:r>
+      <w:r>
+        <w:rPr>
+          <w:lang w:val="en-NZ"/>
+        </w:rPr>
+        <w:t xml:space="preserve"> </w:t>
+      </w:r>
+      <w:r>
+        <w:rPr>
+          <w:lang w:val="en-NZ"/>
+        </w:rPr>
+        <w:t xml:space="preserve">the </w:t>
+      </w:r>
+      <w:r>
+        <w:rPr>
+          <w:lang w:val="en-NZ"/>
+        </w:rPr>
+        <w:t>interesting approaches th</w:t>
+      </w:r>
+      <w:r>
+        <w:rPr>
+          <w:lang w:val="en-NZ"/>
+        </w:rPr>
+        <w:t>at</w:t>
+      </w:r>
+      <w:r>
+        <w:rPr>
+          <w:lang w:val="en-NZ"/>
+        </w:rPr>
+        <w:t xml:space="preserve"> students </w:t>
+      </w:r>
+      <w:r>
+        <w:rPr>
+          <w:lang w:val="en-NZ"/>
+        </w:rPr>
+        <w:t>and teaching staff were proposing while also helped in</w:t>
+      </w:r>
+      <w:r>
+        <w:rPr>
+          <w:lang w:val="en-NZ"/>
+        </w:rPr>
+        <w:t xml:space="preserve"> redesign those</w:t>
+      </w:r>
+      <w:r>
+        <w:rPr>
+          <w:lang w:val="en-NZ"/>
+        </w:rPr>
+        <w:t xml:space="preserve"> elements</w:t>
+      </w:r>
+      <w:r>
+        <w:rPr>
+          <w:lang w:val="en-NZ"/>
+        </w:rPr>
+        <w:t xml:space="preserve"> that were promoting problematic behaviours.</w:t>
+      </w:r>
+    </w:p>
+    <w:p>
+      <w:pPr>
+        <w:rPr>
+          <w:lang w:val="en-NZ"/>
+        </w:rPr>
+      </w:pPr>
+      <w:r>
+        <w:rPr>
+          <w:lang w:val="en-NZ"/>
+        </w:rPr>
+        <w:t xml:space="preserve">The results obtained showed that students benefited the most with a strong sense of structure when initially establishing relationships with the group, and appreciated more flexible activities once the work dynamics were clearly defined and producing results. The visual and interactive elements proposed by WorkshopAR helped the students understand and be aware of the need of those structures, </w:t>
+      </w:r>
+      <w:r>
+        <w:rPr>
+          <w:lang w:val="en-NZ"/>
+        </w:rPr>
+        <w:t xml:space="preserve">promoting discussions and guiding work using more impactful collaborative approaches, </w:t>
+      </w:r>
+      <w:r>
+        <w:rPr>
+          <w:lang w:val="en-NZ"/>
+        </w:rPr>
+        <w:t xml:space="preserve">but failed to integrated in a more substantial way </w:t>
+      </w:r>
+      <w:r>
+        <w:rPr>
+          <w:lang w:val="en-NZ"/>
+        </w:rPr>
+        <w:t xml:space="preserve">in the </w:t>
+      </w:r>
+      <w:r>
+        <w:rPr>
+          <w:lang w:val="en-NZ"/>
+        </w:rPr>
+        <w:t>workflow</w:t>
+      </w:r>
+      <w:r>
+        <w:rPr>
+          <w:lang w:val="en-NZ"/>
+        </w:rPr>
+        <w:t>s</w:t>
+      </w:r>
+      <w:r>
+        <w:rPr>
+          <w:lang w:val="en-NZ"/>
+        </w:rPr>
+        <w:t xml:space="preserve"> that students</w:t>
+      </w:r>
+      <w:r>
+        <w:rPr>
+          <w:lang w:val="en-NZ"/>
+        </w:rPr>
+        <w:t xml:space="preserve"> had already </w:t>
+      </w:r>
+      <w:r>
+        <w:rPr>
+          <w:lang w:val="en-NZ"/>
+        </w:rPr>
+        <w:t>created using</w:t>
+      </w:r>
+      <w:r>
+        <w:rPr>
+          <w:lang w:val="en-NZ"/>
+        </w:rPr>
+        <w:t xml:space="preserve"> a variety of other tools that were better integrated into each other.</w:t>
+      </w:r>
+      <w:r>
+        <w:rPr>
+          <w:lang w:val="en-NZ"/>
+        </w:rPr>
+        <w:t xml:space="preserve">  </w:t>
+      </w:r>
+      <w:r>
+        <w:rPr>
+          <w:lang w:val="en-NZ"/>
+        </w:rPr>
+        <w:t xml:space="preserve">WorkshopAR was able to pivot when aspects of its design were promoting behaviours that were </w:t>
+      </w:r>
+      <w:r>
+        <w:rPr>
+          <w:lang w:val="en-NZ"/>
+        </w:rPr>
+        <w:lastRenderedPageBreak/>
+        <w:t>not in line with the learning goals of the course or the research, and several opportunities in the creation of collaborative spaces</w:t>
+      </w:r>
+      <w:r>
+        <w:rPr>
+          <w:lang w:val="en-NZ"/>
+        </w:rPr>
+        <w:t xml:space="preserve"> and communication mediated by AR can be worked upon in future research.</w:t>
+      </w:r>
+    </w:p>
+    <w:p>
+      <w:pPr>
+        <w:rPr>
+          <w:lang w:val="en-NZ"/>
+        </w:rPr>
+      </w:pPr>
+    </w:p>
+    <w:p>
+      <w:pPr>
+        <w:pStyle w:val="Heading1"/>
         <w:rPr>
           <w:lang w:val="en-NZ"/>
         </w:rPr>
@@ -97,7 +836,7 @@
       <w:hyperlink r:id="rId4" w:history="1">
         <w:r>
           <w:rPr>
-            <w:rStyle w:val="Hipervnculo"/>
+            <w:rStyle w:val="Hyperlink"/>
             <w:lang w:val="en-NZ"/>
           </w:rPr>
           <w:t>https://github.com/speregil/ar-survey-annex.git</w:t>
@@ -114,7 +853,21 @@
         <w:rPr>
           <w:lang w:val="en-NZ"/>
         </w:rPr>
-        <w:t>This SLR codified a total of 67 different articles related to the use of AR in educational settings. The analysis phase of the review focused on mapping what educational goals were more prevalent in the educational design present in all the surveyed projects. This information was codified using the BRT framework to understand the cognitive complexity of the goals identified, while the goals themselves were codified using the verb + statement approach proposed by Fuchs and Deno (1982).</w:t>
+        <w:t xml:space="preserve">This SLR codified a total of 67 different articles related to the use of AR in educational settings. The analysis phase of the review focused on mapping what educational goals were more prevalent in the educational design present in all the surveyed projects. This information was codified using the BRT framework to understand the cognitive complexity of the goals identified, while the goals themselves were codified using the verb + statement approach proposed by Fuchs and </w:t>
+      </w:r>
+      <w:proofErr w:type="spellStart"/>
+      <w:r>
+        <w:rPr>
+          <w:lang w:val="en-NZ"/>
+        </w:rPr>
+        <w:t>Deno</w:t>
+      </w:r>
+      <w:proofErr w:type="spellEnd"/>
+      <w:r>
+        <w:rPr>
+          <w:lang w:val="en-NZ"/>
+        </w:rPr>
+        <w:t xml:space="preserve"> (1982).</w:t>
       </w:r>
     </w:p>
     <w:p>
@@ -132,7 +885,7 @@
     </w:p>
     <w:p>
       <w:pPr>
-        <w:pStyle w:val="Descripcin"/>
+        <w:pStyle w:val="Caption"/>
         <w:keepNext/>
         <w:jc w:val="center"/>
         <w:rPr>
@@ -185,7 +938,7 @@
     </w:p>
     <w:tbl>
       <w:tblPr>
-        <w:tblStyle w:val="Tablaconcuadrcula"/>
+        <w:tblStyle w:val="TableGrid"/>
         <w:tblW w:w="8941" w:type="dxa"/>
         <w:tblLook w:val="04A0" w:firstRow="1" w:lastRow="0" w:firstColumn="1" w:lastColumn="0" w:noHBand="0" w:noVBand="1"/>
       </w:tblPr>
@@ -557,7 +1310,6 @@
                 <w:bCs/>
                 <w:lang w:val="en-NZ"/>
               </w:rPr>
-              <w:lastRenderedPageBreak/>
               <w:t>AR Technology</w:t>
             </w:r>
           </w:p>
@@ -730,6 +1482,7 @@
                 <w:bCs/>
                 <w:lang w:val="en-NZ"/>
               </w:rPr>
+              <w:lastRenderedPageBreak/>
               <w:t>Explicit Goal</w:t>
             </w:r>
           </w:p>
@@ -1062,7 +1815,7 @@
     </w:p>
     <w:p>
       <w:pPr>
-        <w:pStyle w:val="Descripcin"/>
+        <w:pStyle w:val="Caption"/>
         <w:keepNext/>
         <w:jc w:val="center"/>
         <w:rPr>
@@ -1115,7 +1868,7 @@
     </w:p>
     <w:tbl>
       <w:tblPr>
-        <w:tblStyle w:val="Tablaconcuadrcula"/>
+        <w:tblStyle w:val="TableGrid"/>
         <w:tblW w:w="8941" w:type="dxa"/>
         <w:tblLook w:val="04A0" w:firstRow="1" w:lastRow="0" w:firstColumn="1" w:lastColumn="0" w:noHBand="0" w:noVBand="1"/>
       </w:tblPr>
@@ -1356,7 +2109,13 @@
               <w:rPr>
                 <w:lang w:val="en-NZ"/>
               </w:rPr>
-              <w:t>Pocedural. Knowledge on the components and execution of a tasks, the reasoning behind them and how they affect their context</w:t>
+              <w:t>Procedural</w:t>
+            </w:r>
+            <w:r>
+              <w:rPr>
+                <w:lang w:val="en-NZ"/>
+              </w:rPr>
+              <w:t>. Knowledge on the components and execution of a tasks, the reasoning behind them and how they affect their context</w:t>
             </w:r>
           </w:p>
         </w:tc>
@@ -1757,7 +2516,14 @@
         <w:rPr>
           <w:lang w:val="en-NZ"/>
         </w:rPr>
-        <w:t>Finally, the Positive and Negative Outcomes fields codify the main themes and categories found on the recount of experiences extracted from the results, analysis and conclusions of the reviewed works. The categorisation process</w:t>
+        <w:t xml:space="preserve">Finally, the Positive and Negative Outcomes fields codify the main themes and categories found on the recount of experiences extracted from the results, analysis and conclusions of the reviewed </w:t>
+      </w:r>
+      <w:r>
+        <w:rPr>
+          <w:lang w:val="en-NZ"/>
+        </w:rPr>
+        <w:lastRenderedPageBreak/>
+        <w:t>works. The categorisation process</w:t>
       </w:r>
       <w:r>
         <w:rPr>
@@ -1780,7 +2546,7 @@
     </w:p>
     <w:p>
       <w:pPr>
-        <w:pStyle w:val="Descripcin"/>
+        <w:pStyle w:val="Caption"/>
         <w:keepNext/>
         <w:jc w:val="center"/>
         <w:rPr>
@@ -1833,7 +2599,7 @@
     </w:p>
     <w:tbl>
       <w:tblPr>
-        <w:tblStyle w:val="Tablaconcuadrcula"/>
+        <w:tblStyle w:val="TableGrid"/>
         <w:tblW w:w="8926" w:type="dxa"/>
         <w:tblLook w:val="04A0" w:firstRow="1" w:lastRow="0" w:firstColumn="1" w:lastColumn="0" w:noHBand="0" w:noVBand="1"/>
       </w:tblPr>
@@ -3003,11 +3769,19 @@
                 <w:lang w:val="en-NZ"/>
               </w:rPr>
             </w:pPr>
-            <w:r>
-              <w:rPr>
-                <w:lang w:val="en-NZ"/>
-              </w:rPr>
-              <w:t>Students report feeling more confident in what they learned and the long-term retention of it</w:t>
+            <w:proofErr w:type="gramStart"/>
+            <w:r>
+              <w:rPr>
+                <w:lang w:val="en-NZ"/>
+              </w:rPr>
+              <w:t>Students</w:t>
+            </w:r>
+            <w:proofErr w:type="gramEnd"/>
+            <w:r>
+              <w:rPr>
+                <w:lang w:val="en-NZ"/>
+              </w:rPr>
+              <w:t xml:space="preserve"> report feeling more confident in what they learned and the long-term retention of it</w:t>
             </w:r>
           </w:p>
         </w:tc>
@@ -4020,7 +4794,6 @@
               <w:rPr>
                 <w:lang w:val="en-NZ"/>
               </w:rPr>
-              <w:lastRenderedPageBreak/>
               <w:t>Multimedia learning</w:t>
             </w:r>
           </w:p>
@@ -4491,7 +5264,7 @@
     </w:p>
     <w:p>
       <w:pPr>
-        <w:pStyle w:val="Descripcin"/>
+        <w:pStyle w:val="Caption"/>
         <w:keepNext/>
         <w:jc w:val="center"/>
         <w:rPr>
@@ -4544,7 +5317,7 @@
     </w:p>
     <w:tbl>
       <w:tblPr>
-        <w:tblStyle w:val="Tablaconcuadrcula"/>
+        <w:tblStyle w:val="TableGrid"/>
         <w:tblW w:w="8926" w:type="dxa"/>
         <w:tblLook w:val="04A0" w:firstRow="1" w:lastRow="0" w:firstColumn="1" w:lastColumn="0" w:noHBand="0" w:noVBand="1"/>
       </w:tblPr>
@@ -5312,8 +6085,16 @@
               <w:rPr>
                 <w:lang w:val="en-NZ"/>
               </w:rPr>
-              <w:t>Accuracy problems for geolocalization</w:t>
-            </w:r>
+              <w:t xml:space="preserve">Accuracy problems for </w:t>
+            </w:r>
+            <w:proofErr w:type="spellStart"/>
+            <w:r>
+              <w:rPr>
+                <w:lang w:val="en-NZ"/>
+              </w:rPr>
+              <w:t>geolocalization</w:t>
+            </w:r>
+            <w:proofErr w:type="spellEnd"/>
           </w:p>
         </w:tc>
         <w:tc>
@@ -5331,7 +6112,21 @@
               <w:rPr>
                 <w:lang w:val="en-NZ"/>
               </w:rPr>
-              <w:t>AR is based on geolocalization, and it lacked precision or was to erratic</w:t>
+              <w:t xml:space="preserve">AR is based on </w:t>
+            </w:r>
+            <w:proofErr w:type="spellStart"/>
+            <w:r>
+              <w:rPr>
+                <w:lang w:val="en-NZ"/>
+              </w:rPr>
+              <w:t>geolocalization</w:t>
+            </w:r>
+            <w:proofErr w:type="spellEnd"/>
+            <w:r>
+              <w:rPr>
+                <w:lang w:val="en-NZ"/>
+              </w:rPr>
+              <w:t>, and it lacked precision or was to erratic</w:t>
             </w:r>
           </w:p>
         </w:tc>
@@ -6219,7 +7014,6 @@
               <w:rPr>
                 <w:lang w:val="en-NZ"/>
               </w:rPr>
-              <w:lastRenderedPageBreak/>
               <w:t>Motivation issues</w:t>
             </w:r>
           </w:p>
@@ -7375,7 +8169,7 @@
 </file>
 
 <file path=word/styles.xml><?xml version="1.0" encoding="utf-8"?>
-<w:styles xmlns:mc="http://schemas.openxmlformats.org/markup-compatibility/2006" xmlns:r="http://schemas.openxmlformats.org/officeDocument/2006/relationships" xmlns:w="http://schemas.openxmlformats.org/wordprocessingml/2006/main" xmlns:w14="http://schemas.microsoft.com/office/word/2010/wordml" xmlns:w15="http://schemas.microsoft.com/office/word/2012/wordml" xmlns:w16cex="http://schemas.microsoft.com/office/word/2018/wordml/cex" xmlns:w16cid="http://schemas.microsoft.com/office/word/2016/wordml/cid" xmlns:w16="http://schemas.microsoft.com/office/word/2018/wordml" xmlns:w16du="http://schemas.microsoft.com/office/word/2023/wordml/word16du" xmlns:w16sdtdh="http://schemas.microsoft.com/office/word/2020/wordml/sdtdatahash" xmlns:w16sdtfl="http://schemas.microsoft.com/office/word/2024/wordml/sdtformatlock" xmlns:w16se="http://schemas.microsoft.com/office/word/2015/wordml/symex" mc:Ignorable="w14 w15 w16se w16cid w16 w16cex w16sdtdh w16sdtfl w16du">
+<w:styles xmlns:mc="http://schemas.openxmlformats.org/markup-compatibility/2006" xmlns:r="http://schemas.openxmlformats.org/officeDocument/2006/relationships" xmlns:w="http://schemas.openxmlformats.org/wordprocessingml/2006/main" xmlns:w14="http://schemas.microsoft.com/office/word/2010/wordml" xmlns:w15="http://schemas.microsoft.com/office/word/2012/wordml" xmlns:w16cex="http://schemas.microsoft.com/office/word/2018/wordml/cex" xmlns:w16cid="http://schemas.microsoft.com/office/word/2016/wordml/cid" xmlns:w16="http://schemas.microsoft.com/office/word/2018/wordml" xmlns:w16sdtdh="http://schemas.microsoft.com/office/word/2020/wordml/sdtdatahash" xmlns:w16se="http://schemas.microsoft.com/office/word/2015/wordml/symex" mc:Ignorable="w14 w15 w16se w16cid w16 w16cex w16sdtdh">
   <w:docDefaults>
     <w:rPrDefault>
       <w:rPr>
@@ -7775,11 +8569,11 @@
     <w:name w:val="Normal"/>
     <w:qFormat/>
   </w:style>
-  <w:style w:type="paragraph" w:styleId="Ttulo1">
+  <w:style w:type="paragraph" w:styleId="Heading1">
     <w:name w:val="heading 1"/>
     <w:basedOn w:val="Normal"/>
     <w:next w:val="Normal"/>
-    <w:link w:val="Ttulo1Car"/>
+    <w:link w:val="Heading1Char"/>
     <w:uiPriority w:val="9"/>
     <w:qFormat/>
     <w:rsid w:val="00F90F28"/>
@@ -7796,11 +8590,11 @@
       <w:szCs w:val="40"/>
     </w:rPr>
   </w:style>
-  <w:style w:type="paragraph" w:styleId="Ttulo2">
+  <w:style w:type="paragraph" w:styleId="Heading2">
     <w:name w:val="heading 2"/>
     <w:basedOn w:val="Normal"/>
     <w:next w:val="Normal"/>
-    <w:link w:val="Ttulo2Car"/>
+    <w:link w:val="Heading2Char"/>
     <w:uiPriority w:val="9"/>
     <w:semiHidden/>
     <w:unhideWhenUsed/>
@@ -7819,11 +8613,11 @@
       <w:szCs w:val="32"/>
     </w:rPr>
   </w:style>
-  <w:style w:type="paragraph" w:styleId="Ttulo3">
+  <w:style w:type="paragraph" w:styleId="Heading3">
     <w:name w:val="heading 3"/>
     <w:basedOn w:val="Normal"/>
     <w:next w:val="Normal"/>
-    <w:link w:val="Ttulo3Car"/>
+    <w:link w:val="Heading3Char"/>
     <w:uiPriority w:val="9"/>
     <w:semiHidden/>
     <w:unhideWhenUsed/>
@@ -7842,11 +8636,11 @@
       <w:szCs w:val="28"/>
     </w:rPr>
   </w:style>
-  <w:style w:type="paragraph" w:styleId="Ttulo4">
+  <w:style w:type="paragraph" w:styleId="Heading4">
     <w:name w:val="heading 4"/>
     <w:basedOn w:val="Normal"/>
     <w:next w:val="Normal"/>
-    <w:link w:val="Ttulo4Car"/>
+    <w:link w:val="Heading4Char"/>
     <w:uiPriority w:val="9"/>
     <w:semiHidden/>
     <w:unhideWhenUsed/>
@@ -7865,11 +8659,11 @@
       <w:color w:val="0F4761" w:themeColor="accent1" w:themeShade="BF"/>
     </w:rPr>
   </w:style>
-  <w:style w:type="paragraph" w:styleId="Ttulo5">
+  <w:style w:type="paragraph" w:styleId="Heading5">
     <w:name w:val="heading 5"/>
     <w:basedOn w:val="Normal"/>
     <w:next w:val="Normal"/>
-    <w:link w:val="Ttulo5Car"/>
+    <w:link w:val="Heading5Char"/>
     <w:uiPriority w:val="9"/>
     <w:semiHidden/>
     <w:unhideWhenUsed/>
@@ -7886,11 +8680,11 @@
       <w:color w:val="0F4761" w:themeColor="accent1" w:themeShade="BF"/>
     </w:rPr>
   </w:style>
-  <w:style w:type="paragraph" w:styleId="Ttulo6">
+  <w:style w:type="paragraph" w:styleId="Heading6">
     <w:name w:val="heading 6"/>
     <w:basedOn w:val="Normal"/>
     <w:next w:val="Normal"/>
-    <w:link w:val="Ttulo6Car"/>
+    <w:link w:val="Heading6Char"/>
     <w:uiPriority w:val="9"/>
     <w:semiHidden/>
     <w:unhideWhenUsed/>
@@ -7909,11 +8703,11 @@
       <w:color w:val="595959" w:themeColor="text1" w:themeTint="A6"/>
     </w:rPr>
   </w:style>
-  <w:style w:type="paragraph" w:styleId="Ttulo7">
+  <w:style w:type="paragraph" w:styleId="Heading7">
     <w:name w:val="heading 7"/>
     <w:basedOn w:val="Normal"/>
     <w:next w:val="Normal"/>
-    <w:link w:val="Ttulo7Car"/>
+    <w:link w:val="Heading7Char"/>
     <w:uiPriority w:val="9"/>
     <w:semiHidden/>
     <w:unhideWhenUsed/>
@@ -7930,11 +8724,11 @@
       <w:color w:val="595959" w:themeColor="text1" w:themeTint="A6"/>
     </w:rPr>
   </w:style>
-  <w:style w:type="paragraph" w:styleId="Ttulo8">
+  <w:style w:type="paragraph" w:styleId="Heading8">
     <w:name w:val="heading 8"/>
     <w:basedOn w:val="Normal"/>
     <w:next w:val="Normal"/>
-    <w:link w:val="Ttulo8Car"/>
+    <w:link w:val="Heading8Char"/>
     <w:uiPriority w:val="9"/>
     <w:semiHidden/>
     <w:unhideWhenUsed/>
@@ -7953,11 +8747,11 @@
       <w:color w:val="272727" w:themeColor="text1" w:themeTint="D8"/>
     </w:rPr>
   </w:style>
-  <w:style w:type="paragraph" w:styleId="Ttulo9">
+  <w:style w:type="paragraph" w:styleId="Heading9">
     <w:name w:val="heading 9"/>
     <w:basedOn w:val="Normal"/>
     <w:next w:val="Normal"/>
-    <w:link w:val="Ttulo9Car"/>
+    <w:link w:val="Heading9Char"/>
     <w:uiPriority w:val="9"/>
     <w:semiHidden/>
     <w:unhideWhenUsed/>
@@ -7974,13 +8768,13 @@
       <w:color w:val="272727" w:themeColor="text1" w:themeTint="D8"/>
     </w:rPr>
   </w:style>
-  <w:style w:type="character" w:default="1" w:styleId="Fuentedeprrafopredeter">
+  <w:style w:type="character" w:default="1" w:styleId="DefaultParagraphFont">
     <w:name w:val="Default Paragraph Font"/>
     <w:uiPriority w:val="1"/>
     <w:semiHidden/>
     <w:unhideWhenUsed/>
   </w:style>
-  <w:style w:type="table" w:default="1" w:styleId="Tablanormal">
+  <w:style w:type="table" w:default="1" w:styleId="TableNormal">
     <w:name w:val="Normal Table"/>
     <w:uiPriority w:val="99"/>
     <w:semiHidden/>
@@ -7995,16 +8789,16 @@
       </w:tblCellMar>
     </w:tblPr>
   </w:style>
-  <w:style w:type="numbering" w:default="1" w:styleId="Sinlista">
+  <w:style w:type="numbering" w:default="1" w:styleId="NoList">
     <w:name w:val="No List"/>
     <w:uiPriority w:val="99"/>
     <w:semiHidden/>
     <w:unhideWhenUsed/>
   </w:style>
-  <w:style w:type="character" w:customStyle="1" w:styleId="Ttulo1Car">
-    <w:name w:val="Título 1 Car"/>
-    <w:basedOn w:val="Fuentedeprrafopredeter"/>
-    <w:link w:val="Ttulo1"/>
+  <w:style w:type="character" w:customStyle="1" w:styleId="Heading1Char">
+    <w:name w:val="Heading 1 Char"/>
+    <w:basedOn w:val="DefaultParagraphFont"/>
+    <w:link w:val="Heading1"/>
     <w:uiPriority w:val="9"/>
     <w:rsid w:val="00F90F28"/>
     <w:rPr>
@@ -8014,10 +8808,10 @@
       <w:szCs w:val="40"/>
     </w:rPr>
   </w:style>
-  <w:style w:type="character" w:customStyle="1" w:styleId="Ttulo2Car">
-    <w:name w:val="Título 2 Car"/>
-    <w:basedOn w:val="Fuentedeprrafopredeter"/>
-    <w:link w:val="Ttulo2"/>
+  <w:style w:type="character" w:customStyle="1" w:styleId="Heading2Char">
+    <w:name w:val="Heading 2 Char"/>
+    <w:basedOn w:val="DefaultParagraphFont"/>
+    <w:link w:val="Heading2"/>
     <w:uiPriority w:val="9"/>
     <w:semiHidden/>
     <w:rsid w:val="00F90F28"/>
@@ -8028,10 +8822,10 @@
       <w:szCs w:val="32"/>
     </w:rPr>
   </w:style>
-  <w:style w:type="character" w:customStyle="1" w:styleId="Ttulo3Car">
-    <w:name w:val="Título 3 Car"/>
-    <w:basedOn w:val="Fuentedeprrafopredeter"/>
-    <w:link w:val="Ttulo3"/>
+  <w:style w:type="character" w:customStyle="1" w:styleId="Heading3Char">
+    <w:name w:val="Heading 3 Char"/>
+    <w:basedOn w:val="DefaultParagraphFont"/>
+    <w:link w:val="Heading3"/>
     <w:uiPriority w:val="9"/>
     <w:semiHidden/>
     <w:rsid w:val="00F90F28"/>
@@ -8042,10 +8836,10 @@
       <w:szCs w:val="28"/>
     </w:rPr>
   </w:style>
-  <w:style w:type="character" w:customStyle="1" w:styleId="Ttulo4Car">
-    <w:name w:val="Título 4 Car"/>
-    <w:basedOn w:val="Fuentedeprrafopredeter"/>
-    <w:link w:val="Ttulo4"/>
+  <w:style w:type="character" w:customStyle="1" w:styleId="Heading4Char">
+    <w:name w:val="Heading 4 Char"/>
+    <w:basedOn w:val="DefaultParagraphFont"/>
+    <w:link w:val="Heading4"/>
     <w:uiPriority w:val="9"/>
     <w:semiHidden/>
     <w:rsid w:val="00F90F28"/>
@@ -8056,10 +8850,10 @@
       <w:color w:val="0F4761" w:themeColor="accent1" w:themeShade="BF"/>
     </w:rPr>
   </w:style>
-  <w:style w:type="character" w:customStyle="1" w:styleId="Ttulo5Car">
-    <w:name w:val="Título 5 Car"/>
-    <w:basedOn w:val="Fuentedeprrafopredeter"/>
-    <w:link w:val="Ttulo5"/>
+  <w:style w:type="character" w:customStyle="1" w:styleId="Heading5Char">
+    <w:name w:val="Heading 5 Char"/>
+    <w:basedOn w:val="DefaultParagraphFont"/>
+    <w:link w:val="Heading5"/>
     <w:uiPriority w:val="9"/>
     <w:semiHidden/>
     <w:rsid w:val="00F90F28"/>
@@ -8068,10 +8862,10 @@
       <w:color w:val="0F4761" w:themeColor="accent1" w:themeShade="BF"/>
     </w:rPr>
   </w:style>
-  <w:style w:type="character" w:customStyle="1" w:styleId="Ttulo6Car">
-    <w:name w:val="Título 6 Car"/>
-    <w:basedOn w:val="Fuentedeprrafopredeter"/>
-    <w:link w:val="Ttulo6"/>
+  <w:style w:type="character" w:customStyle="1" w:styleId="Heading6Char">
+    <w:name w:val="Heading 6 Char"/>
+    <w:basedOn w:val="DefaultParagraphFont"/>
+    <w:link w:val="Heading6"/>
     <w:uiPriority w:val="9"/>
     <w:semiHidden/>
     <w:rsid w:val="00F90F28"/>
@@ -8082,10 +8876,10 @@
       <w:color w:val="595959" w:themeColor="text1" w:themeTint="A6"/>
     </w:rPr>
   </w:style>
-  <w:style w:type="character" w:customStyle="1" w:styleId="Ttulo7Car">
-    <w:name w:val="Título 7 Car"/>
-    <w:basedOn w:val="Fuentedeprrafopredeter"/>
-    <w:link w:val="Ttulo7"/>
+  <w:style w:type="character" w:customStyle="1" w:styleId="Heading7Char">
+    <w:name w:val="Heading 7 Char"/>
+    <w:basedOn w:val="DefaultParagraphFont"/>
+    <w:link w:val="Heading7"/>
     <w:uiPriority w:val="9"/>
     <w:semiHidden/>
     <w:rsid w:val="00F90F28"/>
@@ -8094,10 +8888,10 @@
       <w:color w:val="595959" w:themeColor="text1" w:themeTint="A6"/>
     </w:rPr>
   </w:style>
-  <w:style w:type="character" w:customStyle="1" w:styleId="Ttulo8Car">
-    <w:name w:val="Título 8 Car"/>
-    <w:basedOn w:val="Fuentedeprrafopredeter"/>
-    <w:link w:val="Ttulo8"/>
+  <w:style w:type="character" w:customStyle="1" w:styleId="Heading8Char">
+    <w:name w:val="Heading 8 Char"/>
+    <w:basedOn w:val="DefaultParagraphFont"/>
+    <w:link w:val="Heading8"/>
     <w:uiPriority w:val="9"/>
     <w:semiHidden/>
     <w:rsid w:val="00F90F28"/>
@@ -8108,10 +8902,10 @@
       <w:color w:val="272727" w:themeColor="text1" w:themeTint="D8"/>
     </w:rPr>
   </w:style>
-  <w:style w:type="character" w:customStyle="1" w:styleId="Ttulo9Car">
-    <w:name w:val="Título 9 Car"/>
-    <w:basedOn w:val="Fuentedeprrafopredeter"/>
-    <w:link w:val="Ttulo9"/>
+  <w:style w:type="character" w:customStyle="1" w:styleId="Heading9Char">
+    <w:name w:val="Heading 9 Char"/>
+    <w:basedOn w:val="DefaultParagraphFont"/>
+    <w:link w:val="Heading9"/>
     <w:uiPriority w:val="9"/>
     <w:semiHidden/>
     <w:rsid w:val="00F90F28"/>
@@ -8120,11 +8914,11 @@
       <w:color w:val="272727" w:themeColor="text1" w:themeTint="D8"/>
     </w:rPr>
   </w:style>
-  <w:style w:type="paragraph" w:styleId="Ttulo">
+  <w:style w:type="paragraph" w:styleId="Title">
     <w:name w:val="Title"/>
     <w:basedOn w:val="Normal"/>
     <w:next w:val="Normal"/>
-    <w:link w:val="TtuloCar"/>
+    <w:link w:val="TitleChar"/>
     <w:uiPriority w:val="10"/>
     <w:qFormat/>
     <w:rsid w:val="00F90F28"/>
@@ -8140,10 +8934,10 @@
       <w:szCs w:val="56"/>
     </w:rPr>
   </w:style>
-  <w:style w:type="character" w:customStyle="1" w:styleId="TtuloCar">
-    <w:name w:val="Título Car"/>
-    <w:basedOn w:val="Fuentedeprrafopredeter"/>
-    <w:link w:val="Ttulo"/>
+  <w:style w:type="character" w:customStyle="1" w:styleId="TitleChar">
+    <w:name w:val="Title Char"/>
+    <w:basedOn w:val="DefaultParagraphFont"/>
+    <w:link w:val="Title"/>
     <w:uiPriority w:val="10"/>
     <w:rsid w:val="00F90F28"/>
     <w:rPr>
@@ -8154,11 +8948,11 @@
       <w:szCs w:val="56"/>
     </w:rPr>
   </w:style>
-  <w:style w:type="paragraph" w:styleId="Subttulo">
+  <w:style w:type="paragraph" w:styleId="Subtitle">
     <w:name w:val="Subtitle"/>
     <w:basedOn w:val="Normal"/>
     <w:next w:val="Normal"/>
-    <w:link w:val="SubttuloCar"/>
+    <w:link w:val="SubtitleChar"/>
     <w:uiPriority w:val="11"/>
     <w:qFormat/>
     <w:rsid w:val="00F90F28"/>
@@ -8175,10 +8969,10 @@
       <w:szCs w:val="28"/>
     </w:rPr>
   </w:style>
-  <w:style w:type="character" w:customStyle="1" w:styleId="SubttuloCar">
-    <w:name w:val="Subtítulo Car"/>
-    <w:basedOn w:val="Fuentedeprrafopredeter"/>
-    <w:link w:val="Subttulo"/>
+  <w:style w:type="character" w:customStyle="1" w:styleId="SubtitleChar">
+    <w:name w:val="Subtitle Char"/>
+    <w:basedOn w:val="DefaultParagraphFont"/>
+    <w:link w:val="Subtitle"/>
     <w:uiPriority w:val="11"/>
     <w:rsid w:val="00F90F28"/>
     <w:rPr>
@@ -8189,11 +8983,11 @@
       <w:szCs w:val="28"/>
     </w:rPr>
   </w:style>
-  <w:style w:type="paragraph" w:styleId="Cita">
+  <w:style w:type="paragraph" w:styleId="Quote">
     <w:name w:val="Quote"/>
     <w:basedOn w:val="Normal"/>
     <w:next w:val="Normal"/>
-    <w:link w:val="CitaCar"/>
+    <w:link w:val="QuoteChar"/>
     <w:uiPriority w:val="29"/>
     <w:qFormat/>
     <w:rsid w:val="00F90F28"/>
@@ -8207,10 +9001,10 @@
       <w:color w:val="404040" w:themeColor="text1" w:themeTint="BF"/>
     </w:rPr>
   </w:style>
-  <w:style w:type="character" w:customStyle="1" w:styleId="CitaCar">
-    <w:name w:val="Cita Car"/>
-    <w:basedOn w:val="Fuentedeprrafopredeter"/>
-    <w:link w:val="Cita"/>
+  <w:style w:type="character" w:customStyle="1" w:styleId="QuoteChar">
+    <w:name w:val="Quote Char"/>
+    <w:basedOn w:val="DefaultParagraphFont"/>
+    <w:link w:val="Quote"/>
     <w:uiPriority w:val="29"/>
     <w:rsid w:val="00F90F28"/>
     <w:rPr>
@@ -8219,7 +9013,7 @@
       <w:color w:val="404040" w:themeColor="text1" w:themeTint="BF"/>
     </w:rPr>
   </w:style>
-  <w:style w:type="paragraph" w:styleId="Prrafodelista">
+  <w:style w:type="paragraph" w:styleId="ListParagraph">
     <w:name w:val="List Paragraph"/>
     <w:basedOn w:val="Normal"/>
     <w:uiPriority w:val="34"/>
@@ -8230,9 +9024,9 @@
       <w:contextualSpacing/>
     </w:pPr>
   </w:style>
-  <w:style w:type="character" w:styleId="nfasisintenso">
+  <w:style w:type="character" w:styleId="IntenseEmphasis">
     <w:name w:val="Intense Emphasis"/>
-    <w:basedOn w:val="Fuentedeprrafopredeter"/>
+    <w:basedOn w:val="DefaultParagraphFont"/>
     <w:uiPriority w:val="21"/>
     <w:qFormat/>
     <w:rsid w:val="00F90F28"/>
@@ -8242,11 +9036,11 @@
       <w:color w:val="0F4761" w:themeColor="accent1" w:themeShade="BF"/>
     </w:rPr>
   </w:style>
-  <w:style w:type="paragraph" w:styleId="Citadestacada">
+  <w:style w:type="paragraph" w:styleId="IntenseQuote">
     <w:name w:val="Intense Quote"/>
     <w:basedOn w:val="Normal"/>
     <w:next w:val="Normal"/>
-    <w:link w:val="CitadestacadaCar"/>
+    <w:link w:val="IntenseQuoteChar"/>
     <w:uiPriority w:val="30"/>
     <w:qFormat/>
     <w:rsid w:val="00F90F28"/>
@@ -8265,10 +9059,10 @@
       <w:color w:val="0F4761" w:themeColor="accent1" w:themeShade="BF"/>
     </w:rPr>
   </w:style>
-  <w:style w:type="character" w:customStyle="1" w:styleId="CitadestacadaCar">
-    <w:name w:val="Cita destacada Car"/>
-    <w:basedOn w:val="Fuentedeprrafopredeter"/>
-    <w:link w:val="Citadestacada"/>
+  <w:style w:type="character" w:customStyle="1" w:styleId="IntenseQuoteChar">
+    <w:name w:val="Intense Quote Char"/>
+    <w:basedOn w:val="DefaultParagraphFont"/>
+    <w:link w:val="IntenseQuote"/>
     <w:uiPriority w:val="30"/>
     <w:rsid w:val="00F90F28"/>
     <w:rPr>
@@ -8277,9 +9071,9 @@
       <w:color w:val="0F4761" w:themeColor="accent1" w:themeShade="BF"/>
     </w:rPr>
   </w:style>
-  <w:style w:type="character" w:styleId="Referenciaintensa">
+  <w:style w:type="character" w:styleId="IntenseReference">
     <w:name w:val="Intense Reference"/>
-    <w:basedOn w:val="Fuentedeprrafopredeter"/>
+    <w:basedOn w:val="DefaultParagraphFont"/>
     <w:uiPriority w:val="32"/>
     <w:qFormat/>
     <w:rsid w:val="00F90F28"/>
@@ -8291,9 +9085,9 @@
       <w:spacing w:val="5"/>
     </w:rPr>
   </w:style>
-  <w:style w:type="character" w:styleId="Hipervnculo">
+  <w:style w:type="character" w:styleId="Hyperlink">
     <w:name w:val="Hyperlink"/>
-    <w:basedOn w:val="Fuentedeprrafopredeter"/>
+    <w:basedOn w:val="DefaultParagraphFont"/>
     <w:uiPriority w:val="99"/>
     <w:unhideWhenUsed/>
     <w:rsid w:val="005E1EE9"/>
@@ -8302,9 +9096,9 @@
       <w:u w:val="single"/>
     </w:rPr>
   </w:style>
-  <w:style w:type="character" w:styleId="Mencinsinresolver">
+  <w:style w:type="character" w:styleId="UnresolvedMention">
     <w:name w:val="Unresolved Mention"/>
-    <w:basedOn w:val="Fuentedeprrafopredeter"/>
+    <w:basedOn w:val="DefaultParagraphFont"/>
     <w:uiPriority w:val="99"/>
     <w:semiHidden/>
     <w:unhideWhenUsed/>
@@ -8314,9 +9108,9 @@
       <w:shd w:val="clear" w:color="auto" w:fill="E1DFDD"/>
     </w:rPr>
   </w:style>
-  <w:style w:type="table" w:styleId="Tablaconcuadrcula">
+  <w:style w:type="table" w:styleId="TableGrid">
     <w:name w:val="Table Grid"/>
-    <w:basedOn w:val="Tablanormal"/>
+    <w:basedOn w:val="TableNormal"/>
     <w:uiPriority w:val="39"/>
     <w:rsid w:val="005E1EE9"/>
     <w:pPr>
@@ -8333,7 +9127,7 @@
       </w:tblBorders>
     </w:tblPr>
   </w:style>
-  <w:style w:type="paragraph" w:styleId="Descripcin">
+  <w:style w:type="paragraph" w:styleId="Caption">
     <w:name w:val="caption"/>
     <w:basedOn w:val="Normal"/>
     <w:next w:val="Normal"/>

</xml_diff>

<commit_message>
Ch 5 Second Revision
</commit_message>
<xml_diff>
--- a/Draft/Extra Sections.docx
+++ b/Draft/Extra Sections.docx
@@ -1,10 +1,10 @@
 
 <file path=word/document.xml><?xml version="1.0" encoding="utf-8"?>
-<w:document xmlns:wpc="http://schemas.microsoft.com/office/word/2010/wordprocessingCanvas" xmlns:cx="http://schemas.microsoft.com/office/drawing/2014/chartex" xmlns:cx1="http://schemas.microsoft.com/office/drawing/2015/9/8/chartex" xmlns:cx2="http://schemas.microsoft.com/office/drawing/2015/10/21/chartex" xmlns:cx3="http://schemas.microsoft.com/office/drawing/2016/5/9/chartex" xmlns:cx4="http://schemas.microsoft.com/office/drawing/2016/5/10/chartex" xmlns:cx5="http://schemas.microsoft.com/office/drawing/2016/5/11/chartex" xmlns:cx6="http://schemas.microsoft.com/office/drawing/2016/5/12/chartex" xmlns:cx7="http://schemas.microsoft.com/office/drawing/2016/5/13/chartex" xmlns:cx8="http://schemas.microsoft.com/office/drawing/2016/5/14/chartex" xmlns:mc="http://schemas.openxmlformats.org/markup-compatibility/2006" xmlns:aink="http://schemas.microsoft.com/office/drawing/2016/ink" xmlns:am3d="http://schemas.microsoft.com/office/drawing/2017/model3d" xmlns:o="urn:schemas-microsoft-com:office:office" xmlns:oel="http://schemas.microsoft.com/office/2019/extlst" xmlns:r="http://schemas.openxmlformats.org/officeDocument/2006/relationships" xmlns:m="http://schemas.openxmlformats.org/officeDocument/2006/math" xmlns:v="urn:schemas-microsoft-com:vml" xmlns:wp14="http://schemas.microsoft.com/office/word/2010/wordprocessingDrawing" xmlns:wp="http://schemas.openxmlformats.org/drawingml/2006/wordprocessingDrawing" xmlns:w10="urn:schemas-microsoft-com:office:word" xmlns:w="http://schemas.openxmlformats.org/wordprocessingml/2006/main" xmlns:w14="http://schemas.microsoft.com/office/word/2010/wordml" xmlns:w15="http://schemas.microsoft.com/office/word/2012/wordml" xmlns:w16cex="http://schemas.microsoft.com/office/word/2018/wordml/cex" xmlns:w16cid="http://schemas.microsoft.com/office/word/2016/wordml/cid" xmlns:w16="http://schemas.microsoft.com/office/word/2018/wordml" xmlns:w16du="http://schemas.microsoft.com/office/word/2023/wordml/word16du" xmlns:w16sdtdh="http://schemas.microsoft.com/office/word/2020/wordml/sdtdatahash" xmlns:w16sdtfl="http://schemas.microsoft.com/office/word/2024/wordml/sdtformatlock" xmlns:w16se="http://schemas.microsoft.com/office/word/2015/wordml/symex" xmlns:wpg="http://schemas.microsoft.com/office/word/2010/wordprocessingGroup" xmlns:wpi="http://schemas.microsoft.com/office/word/2010/wordprocessingInk" xmlns:wne="http://schemas.microsoft.com/office/word/2006/wordml" xmlns:wps="http://schemas.microsoft.com/office/word/2010/wordprocessingShape" mc:Ignorable="w14 w15 w16se w16cid w16 w16cex w16sdtdh w16sdtfl w16du wp14">
+<w:document xmlns:wpc="http://schemas.microsoft.com/office/word/2010/wordprocessingCanvas" xmlns:cx="http://schemas.microsoft.com/office/drawing/2014/chartex" xmlns:cx1="http://schemas.microsoft.com/office/drawing/2015/9/8/chartex" xmlns:cx2="http://schemas.microsoft.com/office/drawing/2015/10/21/chartex" xmlns:cx3="http://schemas.microsoft.com/office/drawing/2016/5/9/chartex" xmlns:cx4="http://schemas.microsoft.com/office/drawing/2016/5/10/chartex" xmlns:cx5="http://schemas.microsoft.com/office/drawing/2016/5/11/chartex" xmlns:cx6="http://schemas.microsoft.com/office/drawing/2016/5/12/chartex" xmlns:cx7="http://schemas.microsoft.com/office/drawing/2016/5/13/chartex" xmlns:cx8="http://schemas.microsoft.com/office/drawing/2016/5/14/chartex" xmlns:mc="http://schemas.openxmlformats.org/markup-compatibility/2006" xmlns:aink="http://schemas.microsoft.com/office/drawing/2016/ink" xmlns:am3d="http://schemas.microsoft.com/office/drawing/2017/model3d" xmlns:o="urn:schemas-microsoft-com:office:office" xmlns:r="http://schemas.openxmlformats.org/officeDocument/2006/relationships" xmlns:m="http://schemas.openxmlformats.org/officeDocument/2006/math" xmlns:v="urn:schemas-microsoft-com:vml" xmlns:wp14="http://schemas.microsoft.com/office/word/2010/wordprocessingDrawing" xmlns:wp="http://schemas.openxmlformats.org/drawingml/2006/wordprocessingDrawing" xmlns:w10="urn:schemas-microsoft-com:office:word" xmlns:w="http://schemas.openxmlformats.org/wordprocessingml/2006/main" xmlns:w14="http://schemas.microsoft.com/office/word/2010/wordml" xmlns:w15="http://schemas.microsoft.com/office/word/2012/wordml" xmlns:w16cex="http://schemas.microsoft.com/office/word/2018/wordml/cex" xmlns:w16cid="http://schemas.microsoft.com/office/word/2016/wordml/cid" xmlns:w16="http://schemas.microsoft.com/office/word/2018/wordml" xmlns:w16sdtdh="http://schemas.microsoft.com/office/word/2020/wordml/sdtdatahash" xmlns:w16se="http://schemas.microsoft.com/office/word/2015/wordml/symex" xmlns:wpg="http://schemas.microsoft.com/office/word/2010/wordprocessingGroup" xmlns:wpi="http://schemas.microsoft.com/office/word/2010/wordprocessingInk" xmlns:wne="http://schemas.microsoft.com/office/word/2006/wordml" xmlns:wps="http://schemas.microsoft.com/office/word/2010/wordprocessingShape" mc:Ignorable="w14 w15 w16se w16cid w16 w16cex w16sdtdh wp14">
   <w:body>
     <w:p>
       <w:pPr>
-        <w:pStyle w:val="Ttulo1"/>
+        <w:pStyle w:val="Heading1"/>
         <w:rPr>
           <w:lang w:val="en-NZ"/>
         </w:rPr>
@@ -31,7 +31,7 @@
     </w:p>
     <w:p>
       <w:pPr>
-        <w:pStyle w:val="Ttulo1"/>
+        <w:pStyle w:val="Heading1"/>
         <w:rPr>
           <w:lang w:val="en-NZ"/>
         </w:rPr>
@@ -747,26 +747,26 @@
         <w:rPr>
           <w:lang w:val="en-NZ"/>
         </w:rPr>
-        <w:t xml:space="preserve"> a variety of other tools that were better </w:t>
+        <w:t xml:space="preserve"> a variety of other tools that were better integrated into each other.</w:t>
+      </w:r>
+      <w:r>
+        <w:rPr>
+          <w:lang w:val="en-NZ"/>
+        </w:rPr>
+        <w:t xml:space="preserve">  </w:t>
+      </w:r>
+      <w:r>
+        <w:rPr>
+          <w:lang w:val="en-NZ"/>
+        </w:rPr>
+        <w:t xml:space="preserve">WorkshopAR was able to pivot when aspects of its design were promoting behaviours that were </w:t>
       </w:r>
       <w:r>
         <w:rPr>
           <w:lang w:val="en-NZ"/>
         </w:rPr>
         <w:lastRenderedPageBreak/>
-        <w:t>integrated into each other.</w:t>
-      </w:r>
-      <w:r>
-        <w:rPr>
-          <w:lang w:val="en-NZ"/>
-        </w:rPr>
-        <w:t xml:space="preserve">  </w:t>
-      </w:r>
-      <w:r>
-        <w:rPr>
-          <w:lang w:val="en-NZ"/>
-        </w:rPr>
-        <w:t>WorkshopAR was able to pivot when aspects of its design were promoting behaviours that were not in line with the learning goals of the course or the research, and several opportunities in the creation of collaborative spaces</w:t>
+        <w:t>not in line with the learning goals of the course or the research, and several opportunities in the creation of collaborative spaces</w:t>
       </w:r>
       <w:r>
         <w:rPr>
@@ -784,7 +784,7 @@
     </w:p>
     <w:p>
       <w:pPr>
-        <w:pStyle w:val="Ttulo1"/>
+        <w:pStyle w:val="Heading1"/>
         <w:rPr>
           <w:lang w:val="en-NZ"/>
         </w:rPr>
@@ -836,7 +836,7 @@
       <w:hyperlink r:id="rId4" w:history="1">
         <w:r>
           <w:rPr>
-            <w:rStyle w:val="Hipervnculo"/>
+            <w:rStyle w:val="Hyperlink"/>
             <w:lang w:val="en-NZ"/>
           </w:rPr>
           <w:t>https://github.com/speregil/ar-survey-annex.git</w:t>
@@ -871,7 +871,7 @@
     </w:p>
     <w:p>
       <w:pPr>
-        <w:pStyle w:val="Descripcin"/>
+        <w:pStyle w:val="Caption"/>
         <w:keepNext/>
         <w:jc w:val="center"/>
         <w:rPr>
@@ -924,7 +924,7 @@
     </w:p>
     <w:tbl>
       <w:tblPr>
-        <w:tblStyle w:val="Tablaconcuadrcula"/>
+        <w:tblStyle w:val="TableGrid"/>
         <w:tblW w:w="8941" w:type="dxa"/>
         <w:tblLook w:val="04A0" w:firstRow="1" w:lastRow="0" w:firstColumn="1" w:lastColumn="0" w:noHBand="0" w:noVBand="1"/>
       </w:tblPr>
@@ -1382,7 +1382,6 @@
                 <w:bCs/>
                 <w:lang w:val="en-NZ"/>
               </w:rPr>
-              <w:lastRenderedPageBreak/>
               <w:t>Custom Build</w:t>
             </w:r>
           </w:p>
@@ -1469,6 +1468,7 @@
                 <w:bCs/>
                 <w:lang w:val="en-NZ"/>
               </w:rPr>
+              <w:lastRenderedPageBreak/>
               <w:t>Explicit Goal</w:t>
             </w:r>
           </w:p>
@@ -1801,7 +1801,7 @@
     </w:p>
     <w:p>
       <w:pPr>
-        <w:pStyle w:val="Descripcin"/>
+        <w:pStyle w:val="Caption"/>
         <w:keepNext/>
         <w:jc w:val="center"/>
         <w:rPr>
@@ -1854,7 +1854,7 @@
     </w:p>
     <w:tbl>
       <w:tblPr>
-        <w:tblStyle w:val="Tablaconcuadrcula"/>
+        <w:tblStyle w:val="TableGrid"/>
         <w:tblW w:w="8941" w:type="dxa"/>
         <w:tblLook w:val="04A0" w:firstRow="1" w:lastRow="0" w:firstColumn="1" w:lastColumn="0" w:noHBand="0" w:noVBand="1"/>
       </w:tblPr>
@@ -2502,7 +2502,14 @@
         <w:rPr>
           <w:lang w:val="en-NZ"/>
         </w:rPr>
-        <w:t>Finally, the Positive and Negative Outcomes fields codify the main themes and categories found on the recount of experiences extracted from the results, analysis and conclusions of the reviewed works. The categorisation process</w:t>
+        <w:t xml:space="preserve">Finally, the Positive and Negative Outcomes fields codify the main themes and categories found on the recount of experiences extracted from the results, analysis and conclusions of the reviewed </w:t>
+      </w:r>
+      <w:r>
+        <w:rPr>
+          <w:lang w:val="en-NZ"/>
+        </w:rPr>
+        <w:lastRenderedPageBreak/>
+        <w:t>works. The categorisation process</w:t>
       </w:r>
       <w:r>
         <w:rPr>
@@ -2525,7 +2532,7 @@
     </w:p>
     <w:p>
       <w:pPr>
-        <w:pStyle w:val="Descripcin"/>
+        <w:pStyle w:val="Caption"/>
         <w:keepNext/>
         <w:jc w:val="center"/>
         <w:rPr>
@@ -2578,7 +2585,7 @@
     </w:p>
     <w:tbl>
       <w:tblPr>
-        <w:tblStyle w:val="Tablaconcuadrcula"/>
+        <w:tblStyle w:val="TableGrid"/>
         <w:tblW w:w="8926" w:type="dxa"/>
         <w:tblLook w:val="04A0" w:firstRow="1" w:lastRow="0" w:firstColumn="1" w:lastColumn="0" w:noHBand="0" w:noVBand="1"/>
       </w:tblPr>
@@ -5235,7 +5242,7 @@
     </w:p>
     <w:p>
       <w:pPr>
-        <w:pStyle w:val="Descripcin"/>
+        <w:pStyle w:val="Caption"/>
         <w:keepNext/>
         <w:jc w:val="center"/>
         <w:rPr>
@@ -5288,7 +5295,7 @@
     </w:p>
     <w:tbl>
       <w:tblPr>
-        <w:tblStyle w:val="Tablaconcuadrcula"/>
+        <w:tblStyle w:val="TableGrid"/>
         <w:tblW w:w="8926" w:type="dxa"/>
         <w:tblLook w:val="04A0" w:firstRow="1" w:lastRow="0" w:firstColumn="1" w:lastColumn="0" w:noHBand="0" w:noVBand="1"/>
       </w:tblPr>
@@ -6120,7 +6127,6 @@
               <w:rPr>
                 <w:lang w:val="en-NZ"/>
               </w:rPr>
-              <w:lastRenderedPageBreak/>
               <w:t>Pedagogical design issues</w:t>
             </w:r>
             <w:r>
@@ -8129,6 +8135,1440 @@
           <w:lang w:val="en-NZ"/>
         </w:rPr>
       </w:pPr>
+    </w:p>
+    <w:p>
+      <w:pPr>
+        <w:rPr>
+          <w:lang w:val="en-NZ"/>
+        </w:rPr>
+      </w:pPr>
+    </w:p>
+    <w:p>
+      <w:pPr>
+        <w:rPr>
+          <w:lang w:val="en-NZ"/>
+        </w:rPr>
+      </w:pPr>
+    </w:p>
+    <w:p>
+      <w:pPr>
+        <w:rPr>
+          <w:lang w:val="en-NZ"/>
+        </w:rPr>
+      </w:pPr>
+    </w:p>
+    <w:p>
+      <w:pPr>
+        <w:rPr>
+          <w:lang w:val="en-NZ"/>
+        </w:rPr>
+      </w:pPr>
+    </w:p>
+    <w:p>
+      <w:pPr>
+        <w:rPr>
+          <w:lang w:val="en-NZ"/>
+        </w:rPr>
+      </w:pPr>
+    </w:p>
+    <w:p>
+      <w:pPr>
+        <w:rPr>
+          <w:lang w:val="en-NZ"/>
+        </w:rPr>
+      </w:pPr>
+    </w:p>
+    <w:p>
+      <w:pPr>
+        <w:rPr>
+          <w:lang w:val="en-NZ"/>
+        </w:rPr>
+      </w:pPr>
+    </w:p>
+    <w:p>
+      <w:pPr>
+        <w:rPr>
+          <w:lang w:val="en-NZ"/>
+        </w:rPr>
+      </w:pPr>
+    </w:p>
+    <w:p>
+      <w:pPr>
+        <w:rPr>
+          <w:lang w:val="en-NZ"/>
+        </w:rPr>
+      </w:pPr>
+    </w:p>
+    <w:p>
+      <w:pPr>
+        <w:pStyle w:val="Heading1"/>
+        <w:rPr>
+          <w:lang w:val="en-NZ"/>
+        </w:rPr>
+      </w:pPr>
+      <w:r>
+        <w:rPr>
+          <w:lang w:val="en-NZ"/>
+        </w:rPr>
+        <w:lastRenderedPageBreak/>
+        <w:t xml:space="preserve">Annex </w:t>
+      </w:r>
+      <w:r>
+        <w:rPr>
+          <w:lang w:val="en-NZ"/>
+        </w:rPr>
+        <w:t>B</w:t>
+      </w:r>
+      <w:r>
+        <w:rPr>
+          <w:lang w:val="en-NZ"/>
+        </w:rPr>
+        <w:t xml:space="preserve">: </w:t>
+      </w:r>
+      <w:r>
+        <w:rPr>
+          <w:lang w:val="en-NZ"/>
+        </w:rPr>
+        <w:t>Interaction Gestures in Augmented Reality Collaboration</w:t>
+      </w:r>
+    </w:p>
+    <w:p>
+      <w:pPr>
+        <w:rPr>
+          <w:lang w:val="en-NZ"/>
+        </w:rPr>
+      </w:pPr>
+      <w:r>
+        <w:rPr>
+          <w:rFonts w:ascii="Segoe UI" w:hAnsi="Segoe UI" w:cs="Segoe UI"/>
+          <w:color w:val="1F2328"/>
+          <w:shd w:val="clear" w:color="auto" w:fill="FFFFFF"/>
+          <w:lang w:val="en-NZ"/>
+        </w:rPr>
+        <w:t>This is a collection of 39 videos depicting the final selection of gestures derived from the</w:t>
+      </w:r>
+      <w:r>
+        <w:rPr>
+          <w:rFonts w:ascii="Segoe UI" w:hAnsi="Segoe UI" w:cs="Segoe UI"/>
+          <w:color w:val="1F2328"/>
+          <w:shd w:val="clear" w:color="auto" w:fill="FFFFFF"/>
+          <w:lang w:val="en-NZ"/>
+        </w:rPr>
+        <w:t xml:space="preserve"> </w:t>
+      </w:r>
+      <w:r>
+        <w:rPr>
+          <w:rFonts w:ascii="Segoe UI" w:hAnsi="Segoe UI" w:cs="Segoe UI"/>
+          <w:color w:val="1F2328"/>
+          <w:shd w:val="clear" w:color="auto" w:fill="FFFFFF"/>
+          <w:lang w:val="en-NZ"/>
+        </w:rPr>
+        <w:t xml:space="preserve">research study: Interaction Gestures in Augmented Reality Collaboration. Each video shows a single gesture performed to accomplish a specific task in an augmented reality app, assuming a multi-user, collaborative setting. The gestures were identified using a user-driven design approach </w:t>
+      </w:r>
+      <w:r>
+        <w:rPr>
+          <w:rFonts w:ascii="Segoe UI" w:hAnsi="Segoe UI" w:cs="Segoe UI"/>
+          <w:color w:val="1F2328"/>
+          <w:shd w:val="clear" w:color="auto" w:fill="FFFFFF"/>
+          <w:lang w:val="en-NZ"/>
+        </w:rPr>
+        <w:t>among</w:t>
+      </w:r>
+      <w:r>
+        <w:rPr>
+          <w:rFonts w:ascii="Segoe UI" w:hAnsi="Segoe UI" w:cs="Segoe UI"/>
+          <w:color w:val="1F2328"/>
+          <w:shd w:val="clear" w:color="auto" w:fill="FFFFFF"/>
+          <w:lang w:val="en-NZ"/>
+        </w:rPr>
+        <w:t xml:space="preserve"> 24 different participants. The final selection represents the most common proposals for each task.</w:t>
+      </w:r>
+    </w:p>
+    <w:p>
+      <w:pPr>
+        <w:rPr>
+          <w:lang w:val="en-NZ"/>
+        </w:rPr>
+      </w:pPr>
+      <w:r>
+        <w:rPr>
+          <w:lang w:val="en-NZ"/>
+        </w:rPr>
+        <w:t xml:space="preserve">Video Library: </w:t>
+      </w:r>
+      <w:hyperlink r:id="rId5" w:history="1">
+        <w:r>
+          <w:rPr>
+            <w:rStyle w:val="Hyperlink"/>
+            <w:lang w:val="en-NZ"/>
+          </w:rPr>
+          <w:t>https://github.com/speregil/CollabARGestures</w:t>
+        </w:r>
+      </w:hyperlink>
+    </w:p>
+    <w:p>
+      <w:pPr>
+        <w:rPr>
+          <w:lang w:val="en-NZ"/>
+        </w:rPr>
+      </w:pPr>
+      <w:r>
+        <w:rPr>
+          <w:lang w:val="en-NZ"/>
+        </w:rPr>
+        <w:t>The gestures identified represent the proposals made by users when asked to perform gestures that could accomplish the following tasks in a collaborative setting using AR:</w:t>
+      </w:r>
+    </w:p>
+    <w:tbl>
+      <w:tblPr>
+        <w:tblStyle w:val="GridTable1Light"/>
+        <w:tblW w:w="0" w:type="auto"/>
+        <w:tblLook w:val="04A0" w:firstRow="1" w:lastRow="0" w:firstColumn="1" w:lastColumn="0" w:noHBand="0" w:noVBand="1"/>
+      </w:tblPr>
+      <w:tblGrid>
+        <w:gridCol w:w="980"/>
+        <w:gridCol w:w="2165"/>
+        <w:gridCol w:w="5639"/>
+      </w:tblGrid>
+      <w:tr>
+        <w:trPr>
+          <w:cnfStyle w:val="100000000000" w:firstRow="1" w:lastRow="0" w:firstColumn="0" w:lastColumn="0" w:oddVBand="0" w:evenVBand="0" w:oddHBand="0" w:evenHBand="0" w:firstRowFirstColumn="0" w:firstRowLastColumn="0" w:lastRowFirstColumn="0" w:lastRowLastColumn="0"/>
+        </w:trPr>
+        <w:tc>
+          <w:tcPr>
+            <w:cnfStyle w:val="001000000000" w:firstRow="0" w:lastRow="0" w:firstColumn="1" w:lastColumn="0" w:oddVBand="0" w:evenVBand="0" w:oddHBand="0" w:evenHBand="0" w:firstRowFirstColumn="0" w:firstRowLastColumn="0" w:lastRowFirstColumn="0" w:lastRowLastColumn="0"/>
+            <w:tcW w:w="980" w:type="dxa"/>
+          </w:tcPr>
+          <w:p>
+            <w:pPr>
+              <w:jc w:val="center"/>
+              <w:rPr>
+                <w:lang w:val="en-NZ"/>
+              </w:rPr>
+            </w:pPr>
+            <w:r>
+              <w:rPr>
+                <w:lang w:val="en-NZ"/>
+              </w:rPr>
+              <w:t>ID</w:t>
+            </w:r>
+          </w:p>
+        </w:tc>
+        <w:tc>
+          <w:tcPr>
+            <w:tcW w:w="2165" w:type="dxa"/>
+          </w:tcPr>
+          <w:p>
+            <w:pPr>
+              <w:jc w:val="center"/>
+              <w:cnfStyle w:val="100000000000" w:firstRow="1" w:lastRow="0" w:firstColumn="0" w:lastColumn="0" w:oddVBand="0" w:evenVBand="0" w:oddHBand="0" w:evenHBand="0" w:firstRowFirstColumn="0" w:firstRowLastColumn="0" w:lastRowFirstColumn="0" w:lastRowLastColumn="0"/>
+              <w:rPr>
+                <w:lang w:val="en-NZ"/>
+              </w:rPr>
+            </w:pPr>
+            <w:r>
+              <w:rPr>
+                <w:lang w:val="en-NZ"/>
+              </w:rPr>
+              <w:t>Name</w:t>
+            </w:r>
+          </w:p>
+        </w:tc>
+        <w:tc>
+          <w:tcPr>
+            <w:tcW w:w="5639" w:type="dxa"/>
+          </w:tcPr>
+          <w:p>
+            <w:pPr>
+              <w:jc w:val="center"/>
+              <w:cnfStyle w:val="100000000000" w:firstRow="1" w:lastRow="0" w:firstColumn="0" w:lastColumn="0" w:oddVBand="0" w:evenVBand="0" w:oddHBand="0" w:evenHBand="0" w:firstRowFirstColumn="0" w:firstRowLastColumn="0" w:lastRowFirstColumn="0" w:lastRowLastColumn="0"/>
+              <w:rPr>
+                <w:lang w:val="en-NZ"/>
+              </w:rPr>
+            </w:pPr>
+            <w:r>
+              <w:rPr>
+                <w:lang w:val="en-NZ"/>
+              </w:rPr>
+              <w:t>Description</w:t>
+            </w:r>
+          </w:p>
+        </w:tc>
+      </w:tr>
+      <w:tr>
+        <w:tc>
+          <w:tcPr>
+            <w:cnfStyle w:val="001000000000" w:firstRow="0" w:lastRow="0" w:firstColumn="1" w:lastColumn="0" w:oddVBand="0" w:evenVBand="0" w:oddHBand="0" w:evenHBand="0" w:firstRowFirstColumn="0" w:firstRowLastColumn="0" w:lastRowFirstColumn="0" w:lastRowLastColumn="0"/>
+            <w:tcW w:w="980" w:type="dxa"/>
+          </w:tcPr>
+          <w:p>
+            <w:pPr>
+              <w:jc w:val="center"/>
+              <w:rPr>
+                <w:b w:val="0"/>
+                <w:bCs w:val="0"/>
+                <w:lang w:val="en-NZ"/>
+              </w:rPr>
+            </w:pPr>
+            <w:r>
+              <w:rPr>
+                <w:b w:val="0"/>
+                <w:bCs w:val="0"/>
+                <w:lang w:val="en-NZ"/>
+              </w:rPr>
+              <w:t>Task 1</w:t>
+            </w:r>
+          </w:p>
+        </w:tc>
+        <w:tc>
+          <w:tcPr>
+            <w:tcW w:w="2165" w:type="dxa"/>
+          </w:tcPr>
+          <w:p>
+            <w:pPr>
+              <w:cnfStyle w:val="000000000000" w:firstRow="0" w:lastRow="0" w:firstColumn="0" w:lastColumn="0" w:oddVBand="0" w:evenVBand="0" w:oddHBand="0" w:evenHBand="0" w:firstRowFirstColumn="0" w:firstRowLastColumn="0" w:lastRowFirstColumn="0" w:lastRowLastColumn="0"/>
+              <w:rPr>
+                <w:lang w:val="en-NZ"/>
+              </w:rPr>
+            </w:pPr>
+            <w:r>
+              <w:rPr>
+                <w:lang w:val="en-NZ"/>
+              </w:rPr>
+              <w:t>Point</w:t>
+            </w:r>
+            <w:r>
+              <w:rPr>
+                <w:lang w:val="en-NZ"/>
+              </w:rPr>
+              <w:t>ing</w:t>
+            </w:r>
+            <w:r>
+              <w:rPr>
+                <w:lang w:val="en-NZ"/>
+              </w:rPr>
+              <w:t xml:space="preserve"> at an object</w:t>
+            </w:r>
+          </w:p>
+        </w:tc>
+        <w:tc>
+          <w:tcPr>
+            <w:tcW w:w="5639" w:type="dxa"/>
+          </w:tcPr>
+          <w:p>
+            <w:pPr>
+              <w:cnfStyle w:val="000000000000" w:firstRow="0" w:lastRow="0" w:firstColumn="0" w:lastColumn="0" w:oddVBand="0" w:evenVBand="0" w:oddHBand="0" w:evenHBand="0" w:firstRowFirstColumn="0" w:firstRowLastColumn="0" w:lastRowFirstColumn="0" w:lastRowLastColumn="0"/>
+              <w:rPr>
+                <w:lang w:val="en-NZ"/>
+              </w:rPr>
+            </w:pPr>
+            <w:r>
+              <w:rPr>
+                <w:lang w:val="en-NZ"/>
+              </w:rPr>
+              <w:t>Point to your teammates a digital object in the shared space</w:t>
+            </w:r>
+          </w:p>
+        </w:tc>
+      </w:tr>
+      <w:tr>
+        <w:tc>
+          <w:tcPr>
+            <w:cnfStyle w:val="001000000000" w:firstRow="0" w:lastRow="0" w:firstColumn="1" w:lastColumn="0" w:oddVBand="0" w:evenVBand="0" w:oddHBand="0" w:evenHBand="0" w:firstRowFirstColumn="0" w:firstRowLastColumn="0" w:lastRowFirstColumn="0" w:lastRowLastColumn="0"/>
+            <w:tcW w:w="980" w:type="dxa"/>
+          </w:tcPr>
+          <w:p>
+            <w:pPr>
+              <w:jc w:val="center"/>
+              <w:rPr>
+                <w:b w:val="0"/>
+                <w:bCs w:val="0"/>
+                <w:lang w:val="en-NZ"/>
+              </w:rPr>
+            </w:pPr>
+            <w:r>
+              <w:rPr>
+                <w:b w:val="0"/>
+                <w:bCs w:val="0"/>
+                <w:lang w:val="en-NZ"/>
+              </w:rPr>
+              <w:t>Task 2</w:t>
+            </w:r>
+          </w:p>
+        </w:tc>
+        <w:tc>
+          <w:tcPr>
+            <w:tcW w:w="2165" w:type="dxa"/>
+          </w:tcPr>
+          <w:p>
+            <w:pPr>
+              <w:cnfStyle w:val="000000000000" w:firstRow="0" w:lastRow="0" w:firstColumn="0" w:lastColumn="0" w:oddVBand="0" w:evenVBand="0" w:oddHBand="0" w:evenHBand="0" w:firstRowFirstColumn="0" w:firstRowLastColumn="0" w:lastRowFirstColumn="0" w:lastRowLastColumn="0"/>
+              <w:rPr>
+                <w:lang w:val="en-NZ"/>
+              </w:rPr>
+            </w:pPr>
+            <w:r>
+              <w:rPr>
+                <w:lang w:val="en-NZ"/>
+              </w:rPr>
+              <w:t>Point</w:t>
+            </w:r>
+            <w:r>
+              <w:rPr>
+                <w:lang w:val="en-NZ"/>
+              </w:rPr>
+              <w:t>ing</w:t>
+            </w:r>
+            <w:r>
+              <w:rPr>
+                <w:lang w:val="en-NZ"/>
+              </w:rPr>
+              <w:t xml:space="preserve"> at a place</w:t>
+            </w:r>
+          </w:p>
+        </w:tc>
+        <w:tc>
+          <w:tcPr>
+            <w:tcW w:w="5639" w:type="dxa"/>
+          </w:tcPr>
+          <w:p>
+            <w:pPr>
+              <w:cnfStyle w:val="000000000000" w:firstRow="0" w:lastRow="0" w:firstColumn="0" w:lastColumn="0" w:oddVBand="0" w:evenVBand="0" w:oddHBand="0" w:evenHBand="0" w:firstRowFirstColumn="0" w:firstRowLastColumn="0" w:lastRowFirstColumn="0" w:lastRowLastColumn="0"/>
+              <w:rPr>
+                <w:lang w:val="en-NZ"/>
+              </w:rPr>
+            </w:pPr>
+            <w:r>
+              <w:rPr>
+                <w:lang w:val="en-NZ"/>
+              </w:rPr>
+              <w:t>Point to your teammates a physical object or place in the shared space</w:t>
+            </w:r>
+          </w:p>
+        </w:tc>
+      </w:tr>
+      <w:tr>
+        <w:tc>
+          <w:tcPr>
+            <w:cnfStyle w:val="001000000000" w:firstRow="0" w:lastRow="0" w:firstColumn="1" w:lastColumn="0" w:oddVBand="0" w:evenVBand="0" w:oddHBand="0" w:evenHBand="0" w:firstRowFirstColumn="0" w:firstRowLastColumn="0" w:lastRowFirstColumn="0" w:lastRowLastColumn="0"/>
+            <w:tcW w:w="980" w:type="dxa"/>
+          </w:tcPr>
+          <w:p>
+            <w:pPr>
+              <w:jc w:val="center"/>
+              <w:rPr>
+                <w:b w:val="0"/>
+                <w:bCs w:val="0"/>
+                <w:lang w:val="en-NZ"/>
+              </w:rPr>
+            </w:pPr>
+            <w:r>
+              <w:rPr>
+                <w:b w:val="0"/>
+                <w:bCs w:val="0"/>
+                <w:lang w:val="en-NZ"/>
+              </w:rPr>
+              <w:t>Task 3</w:t>
+            </w:r>
+          </w:p>
+        </w:tc>
+        <w:tc>
+          <w:tcPr>
+            <w:tcW w:w="2165" w:type="dxa"/>
+          </w:tcPr>
+          <w:p>
+            <w:pPr>
+              <w:cnfStyle w:val="000000000000" w:firstRow="0" w:lastRow="0" w:firstColumn="0" w:lastColumn="0" w:oddVBand="0" w:evenVBand="0" w:oddHBand="0" w:evenHBand="0" w:firstRowFirstColumn="0" w:firstRowLastColumn="0" w:lastRowFirstColumn="0" w:lastRowLastColumn="0"/>
+              <w:rPr>
+                <w:lang w:val="en-NZ"/>
+              </w:rPr>
+            </w:pPr>
+            <w:r>
+              <w:rPr>
+                <w:lang w:val="en-NZ"/>
+              </w:rPr>
+              <w:t>Point</w:t>
+            </w:r>
+            <w:r>
+              <w:rPr>
+                <w:lang w:val="en-NZ"/>
+              </w:rPr>
+              <w:t>ing</w:t>
+            </w:r>
+            <w:r>
+              <w:rPr>
+                <w:lang w:val="en-NZ"/>
+              </w:rPr>
+              <w:t xml:space="preserve"> at a person</w:t>
+            </w:r>
+          </w:p>
+        </w:tc>
+        <w:tc>
+          <w:tcPr>
+            <w:tcW w:w="5639" w:type="dxa"/>
+          </w:tcPr>
+          <w:p>
+            <w:pPr>
+              <w:cnfStyle w:val="000000000000" w:firstRow="0" w:lastRow="0" w:firstColumn="0" w:lastColumn="0" w:oddVBand="0" w:evenVBand="0" w:oddHBand="0" w:evenHBand="0" w:firstRowFirstColumn="0" w:firstRowLastColumn="0" w:lastRowFirstColumn="0" w:lastRowLastColumn="0"/>
+              <w:rPr>
+                <w:lang w:val="en-NZ"/>
+              </w:rPr>
+            </w:pPr>
+            <w:r>
+              <w:rPr>
+                <w:lang w:val="en-NZ"/>
+              </w:rPr>
+              <w:t xml:space="preserve">Point to your teammates another person or </w:t>
+            </w:r>
+            <w:r>
+              <w:rPr>
+                <w:lang w:val="en-NZ"/>
+              </w:rPr>
+              <w:t>member of the group</w:t>
+            </w:r>
+          </w:p>
+        </w:tc>
+      </w:tr>
+      <w:tr>
+        <w:tc>
+          <w:tcPr>
+            <w:cnfStyle w:val="001000000000" w:firstRow="0" w:lastRow="0" w:firstColumn="1" w:lastColumn="0" w:oddVBand="0" w:evenVBand="0" w:oddHBand="0" w:evenHBand="0" w:firstRowFirstColumn="0" w:firstRowLastColumn="0" w:lastRowFirstColumn="0" w:lastRowLastColumn="0"/>
+            <w:tcW w:w="980" w:type="dxa"/>
+          </w:tcPr>
+          <w:p>
+            <w:pPr>
+              <w:jc w:val="center"/>
+              <w:rPr>
+                <w:b w:val="0"/>
+                <w:bCs w:val="0"/>
+                <w:lang w:val="en-NZ"/>
+              </w:rPr>
+            </w:pPr>
+            <w:r>
+              <w:rPr>
+                <w:b w:val="0"/>
+                <w:bCs w:val="0"/>
+                <w:lang w:val="en-NZ"/>
+              </w:rPr>
+              <w:t>Task 4</w:t>
+            </w:r>
+          </w:p>
+        </w:tc>
+        <w:tc>
+          <w:tcPr>
+            <w:tcW w:w="2165" w:type="dxa"/>
+          </w:tcPr>
+          <w:p>
+            <w:pPr>
+              <w:cnfStyle w:val="000000000000" w:firstRow="0" w:lastRow="0" w:firstColumn="0" w:lastColumn="0" w:oddVBand="0" w:evenVBand="0" w:oddHBand="0" w:evenHBand="0" w:firstRowFirstColumn="0" w:firstRowLastColumn="0" w:lastRowFirstColumn="0" w:lastRowLastColumn="0"/>
+              <w:rPr>
+                <w:lang w:val="en-NZ"/>
+              </w:rPr>
+            </w:pPr>
+            <w:r>
+              <w:rPr>
+                <w:lang w:val="en-NZ"/>
+              </w:rPr>
+              <w:t>Hold an object</w:t>
+            </w:r>
+          </w:p>
+        </w:tc>
+        <w:tc>
+          <w:tcPr>
+            <w:tcW w:w="5639" w:type="dxa"/>
+          </w:tcPr>
+          <w:p>
+            <w:pPr>
+              <w:cnfStyle w:val="000000000000" w:firstRow="0" w:lastRow="0" w:firstColumn="0" w:lastColumn="0" w:oddVBand="0" w:evenVBand="0" w:oddHBand="0" w:evenHBand="0" w:firstRowFirstColumn="0" w:firstRowLastColumn="0" w:lastRowFirstColumn="0" w:lastRowLastColumn="0"/>
+              <w:rPr>
+                <w:lang w:val="en-NZ"/>
+              </w:rPr>
+            </w:pPr>
+            <w:r>
+              <w:rPr>
+                <w:lang w:val="en-NZ"/>
+              </w:rPr>
+              <w:t>Hold an object present in the shared space</w:t>
+            </w:r>
+          </w:p>
+        </w:tc>
+      </w:tr>
+      <w:tr>
+        <w:tc>
+          <w:tcPr>
+            <w:cnfStyle w:val="001000000000" w:firstRow="0" w:lastRow="0" w:firstColumn="1" w:lastColumn="0" w:oddVBand="0" w:evenVBand="0" w:oddHBand="0" w:evenHBand="0" w:firstRowFirstColumn="0" w:firstRowLastColumn="0" w:lastRowFirstColumn="0" w:lastRowLastColumn="0"/>
+            <w:tcW w:w="980" w:type="dxa"/>
+          </w:tcPr>
+          <w:p>
+            <w:pPr>
+              <w:jc w:val="center"/>
+              <w:rPr>
+                <w:b w:val="0"/>
+                <w:bCs w:val="0"/>
+                <w:lang w:val="en-NZ"/>
+              </w:rPr>
+            </w:pPr>
+            <w:r>
+              <w:rPr>
+                <w:b w:val="0"/>
+                <w:bCs w:val="0"/>
+                <w:lang w:val="en-NZ"/>
+              </w:rPr>
+              <w:t>Task 5</w:t>
+            </w:r>
+          </w:p>
+        </w:tc>
+        <w:tc>
+          <w:tcPr>
+            <w:tcW w:w="2165" w:type="dxa"/>
+          </w:tcPr>
+          <w:p>
+            <w:pPr>
+              <w:cnfStyle w:val="000000000000" w:firstRow="0" w:lastRow="0" w:firstColumn="0" w:lastColumn="0" w:oddVBand="0" w:evenVBand="0" w:oddHBand="0" w:evenHBand="0" w:firstRowFirstColumn="0" w:firstRowLastColumn="0" w:lastRowFirstColumn="0" w:lastRowLastColumn="0"/>
+              <w:rPr>
+                <w:lang w:val="en-NZ"/>
+              </w:rPr>
+            </w:pPr>
+            <w:r>
+              <w:rPr>
+                <w:lang w:val="en-NZ"/>
+              </w:rPr>
+              <w:t>Share an object</w:t>
+            </w:r>
+          </w:p>
+        </w:tc>
+        <w:tc>
+          <w:tcPr>
+            <w:tcW w:w="5639" w:type="dxa"/>
+          </w:tcPr>
+          <w:p>
+            <w:pPr>
+              <w:cnfStyle w:val="000000000000" w:firstRow="0" w:lastRow="0" w:firstColumn="0" w:lastColumn="0" w:oddVBand="0" w:evenVBand="0" w:oddHBand="0" w:evenHBand="0" w:firstRowFirstColumn="0" w:firstRowLastColumn="0" w:lastRowFirstColumn="0" w:lastRowLastColumn="0"/>
+              <w:rPr>
+                <w:lang w:val="en-NZ"/>
+              </w:rPr>
+            </w:pPr>
+            <w:r>
+              <w:rPr>
+                <w:lang w:val="en-NZ"/>
+              </w:rPr>
+              <w:t>Share a held object with a teammate</w:t>
+            </w:r>
+          </w:p>
+        </w:tc>
+      </w:tr>
+      <w:tr>
+        <w:tc>
+          <w:tcPr>
+            <w:cnfStyle w:val="001000000000" w:firstRow="0" w:lastRow="0" w:firstColumn="1" w:lastColumn="0" w:oddVBand="0" w:evenVBand="0" w:oddHBand="0" w:evenHBand="0" w:firstRowFirstColumn="0" w:firstRowLastColumn="0" w:lastRowFirstColumn="0" w:lastRowLastColumn="0"/>
+            <w:tcW w:w="980" w:type="dxa"/>
+          </w:tcPr>
+          <w:p>
+            <w:pPr>
+              <w:jc w:val="center"/>
+              <w:rPr>
+                <w:b w:val="0"/>
+                <w:bCs w:val="0"/>
+                <w:lang w:val="en-NZ"/>
+              </w:rPr>
+            </w:pPr>
+            <w:r>
+              <w:rPr>
+                <w:b w:val="0"/>
+                <w:bCs w:val="0"/>
+                <w:lang w:val="en-NZ"/>
+              </w:rPr>
+              <w:t xml:space="preserve">Task </w:t>
+            </w:r>
+            <w:r>
+              <w:rPr>
+                <w:b w:val="0"/>
+                <w:bCs w:val="0"/>
+                <w:lang w:val="en-NZ"/>
+              </w:rPr>
+              <w:t>6</w:t>
+            </w:r>
+          </w:p>
+        </w:tc>
+        <w:tc>
+          <w:tcPr>
+            <w:tcW w:w="2165" w:type="dxa"/>
+          </w:tcPr>
+          <w:p>
+            <w:pPr>
+              <w:cnfStyle w:val="000000000000" w:firstRow="0" w:lastRow="0" w:firstColumn="0" w:lastColumn="0" w:oddVBand="0" w:evenVBand="0" w:oddHBand="0" w:evenHBand="0" w:firstRowFirstColumn="0" w:firstRowLastColumn="0" w:lastRowFirstColumn="0" w:lastRowLastColumn="0"/>
+              <w:rPr>
+                <w:lang w:val="en-NZ"/>
+              </w:rPr>
+            </w:pPr>
+            <w:r>
+              <w:rPr>
+                <w:lang w:val="en-NZ"/>
+              </w:rPr>
+              <w:t xml:space="preserve">Put </w:t>
+            </w:r>
+            <w:r>
+              <w:rPr>
+                <w:lang w:val="en-NZ"/>
+              </w:rPr>
+              <w:t xml:space="preserve">an </w:t>
+            </w:r>
+            <w:r>
+              <w:rPr>
+                <w:lang w:val="en-NZ"/>
+              </w:rPr>
+              <w:t>object in a private space</w:t>
+            </w:r>
+          </w:p>
+        </w:tc>
+        <w:tc>
+          <w:tcPr>
+            <w:tcW w:w="5639" w:type="dxa"/>
+          </w:tcPr>
+          <w:p>
+            <w:pPr>
+              <w:cnfStyle w:val="000000000000" w:firstRow="0" w:lastRow="0" w:firstColumn="0" w:lastColumn="0" w:oddVBand="0" w:evenVBand="0" w:oddHBand="0" w:evenHBand="0" w:firstRowFirstColumn="0" w:firstRowLastColumn="0" w:lastRowFirstColumn="0" w:lastRowLastColumn="0"/>
+              <w:rPr>
+                <w:lang w:val="en-NZ"/>
+              </w:rPr>
+            </w:pPr>
+            <w:r>
+              <w:rPr>
+                <w:lang w:val="en-NZ"/>
+              </w:rPr>
+              <w:t xml:space="preserve">Put a digital object from the shared space into </w:t>
+            </w:r>
+            <w:r>
+              <w:rPr>
+                <w:lang w:val="en-NZ"/>
+              </w:rPr>
+              <w:t>a</w:t>
+            </w:r>
+            <w:r>
+              <w:rPr>
+                <w:lang w:val="en-NZ"/>
+              </w:rPr>
+              <w:t xml:space="preserve"> private one</w:t>
+            </w:r>
+          </w:p>
+        </w:tc>
+      </w:tr>
+      <w:tr>
+        <w:tc>
+          <w:tcPr>
+            <w:cnfStyle w:val="001000000000" w:firstRow="0" w:lastRow="0" w:firstColumn="1" w:lastColumn="0" w:oddVBand="0" w:evenVBand="0" w:oddHBand="0" w:evenHBand="0" w:firstRowFirstColumn="0" w:firstRowLastColumn="0" w:lastRowFirstColumn="0" w:lastRowLastColumn="0"/>
+            <w:tcW w:w="980" w:type="dxa"/>
+          </w:tcPr>
+          <w:p>
+            <w:pPr>
+              <w:jc w:val="center"/>
+              <w:rPr>
+                <w:b w:val="0"/>
+                <w:bCs w:val="0"/>
+                <w:lang w:val="en-NZ"/>
+              </w:rPr>
+            </w:pPr>
+            <w:r>
+              <w:rPr>
+                <w:b w:val="0"/>
+                <w:bCs w:val="0"/>
+                <w:lang w:val="en-NZ"/>
+              </w:rPr>
+              <w:t xml:space="preserve">Task </w:t>
+            </w:r>
+            <w:r>
+              <w:rPr>
+                <w:b w:val="0"/>
+                <w:bCs w:val="0"/>
+                <w:lang w:val="en-NZ"/>
+              </w:rPr>
+              <w:t>7</w:t>
+            </w:r>
+          </w:p>
+        </w:tc>
+        <w:tc>
+          <w:tcPr>
+            <w:tcW w:w="2165" w:type="dxa"/>
+          </w:tcPr>
+          <w:p>
+            <w:pPr>
+              <w:cnfStyle w:val="000000000000" w:firstRow="0" w:lastRow="0" w:firstColumn="0" w:lastColumn="0" w:oddVBand="0" w:evenVBand="0" w:oddHBand="0" w:evenHBand="0" w:firstRowFirstColumn="0" w:firstRowLastColumn="0" w:lastRowFirstColumn="0" w:lastRowLastColumn="0"/>
+              <w:rPr>
+                <w:lang w:val="en-NZ"/>
+              </w:rPr>
+            </w:pPr>
+            <w:r>
+              <w:rPr>
+                <w:lang w:val="en-NZ"/>
+              </w:rPr>
+              <w:t>Undo a task</w:t>
+            </w:r>
+          </w:p>
+        </w:tc>
+        <w:tc>
+          <w:tcPr>
+            <w:tcW w:w="5639" w:type="dxa"/>
+          </w:tcPr>
+          <w:p>
+            <w:pPr>
+              <w:cnfStyle w:val="000000000000" w:firstRow="0" w:lastRow="0" w:firstColumn="0" w:lastColumn="0" w:oddVBand="0" w:evenVBand="0" w:oddHBand="0" w:evenHBand="0" w:firstRowFirstColumn="0" w:firstRowLastColumn="0" w:lastRowFirstColumn="0" w:lastRowLastColumn="0"/>
+              <w:rPr>
+                <w:lang w:val="en-NZ"/>
+              </w:rPr>
+            </w:pPr>
+            <w:r>
+              <w:rPr>
+                <w:lang w:val="en-NZ"/>
+              </w:rPr>
+              <w:t>Revert</w:t>
+            </w:r>
+            <w:r>
+              <w:rPr>
+                <w:lang w:val="en-NZ"/>
+              </w:rPr>
+              <w:t xml:space="preserve"> any previous action</w:t>
+            </w:r>
+          </w:p>
+        </w:tc>
+      </w:tr>
+      <w:tr>
+        <w:tc>
+          <w:tcPr>
+            <w:cnfStyle w:val="001000000000" w:firstRow="0" w:lastRow="0" w:firstColumn="1" w:lastColumn="0" w:oddVBand="0" w:evenVBand="0" w:oddHBand="0" w:evenHBand="0" w:firstRowFirstColumn="0" w:firstRowLastColumn="0" w:lastRowFirstColumn="0" w:lastRowLastColumn="0"/>
+            <w:tcW w:w="980" w:type="dxa"/>
+          </w:tcPr>
+          <w:p>
+            <w:pPr>
+              <w:jc w:val="center"/>
+              <w:rPr>
+                <w:b w:val="0"/>
+                <w:bCs w:val="0"/>
+                <w:lang w:val="en-NZ"/>
+              </w:rPr>
+            </w:pPr>
+            <w:r>
+              <w:rPr>
+                <w:b w:val="0"/>
+                <w:bCs w:val="0"/>
+                <w:lang w:val="en-NZ"/>
+              </w:rPr>
+              <w:t xml:space="preserve">Task </w:t>
+            </w:r>
+            <w:r>
+              <w:rPr>
+                <w:b w:val="0"/>
+                <w:bCs w:val="0"/>
+                <w:lang w:val="en-NZ"/>
+              </w:rPr>
+              <w:t>8</w:t>
+            </w:r>
+          </w:p>
+        </w:tc>
+        <w:tc>
+          <w:tcPr>
+            <w:tcW w:w="2165" w:type="dxa"/>
+          </w:tcPr>
+          <w:p>
+            <w:pPr>
+              <w:cnfStyle w:val="000000000000" w:firstRow="0" w:lastRow="0" w:firstColumn="0" w:lastColumn="0" w:oddVBand="0" w:evenVBand="0" w:oddHBand="0" w:evenHBand="0" w:firstRowFirstColumn="0" w:firstRowLastColumn="0" w:lastRowFirstColumn="0" w:lastRowLastColumn="0"/>
+              <w:rPr>
+                <w:lang w:val="en-NZ"/>
+              </w:rPr>
+            </w:pPr>
+            <w:r>
+              <w:rPr>
+                <w:lang w:val="en-NZ"/>
+              </w:rPr>
+              <w:t xml:space="preserve">Put </w:t>
+            </w:r>
+            <w:r>
+              <w:rPr>
+                <w:lang w:val="en-NZ"/>
+              </w:rPr>
+              <w:t xml:space="preserve">an </w:t>
+            </w:r>
+            <w:r>
+              <w:rPr>
+                <w:lang w:val="en-NZ"/>
+              </w:rPr>
+              <w:t>object out of a private space</w:t>
+            </w:r>
+          </w:p>
+        </w:tc>
+        <w:tc>
+          <w:tcPr>
+            <w:tcW w:w="5639" w:type="dxa"/>
+          </w:tcPr>
+          <w:p>
+            <w:pPr>
+              <w:cnfStyle w:val="000000000000" w:firstRow="0" w:lastRow="0" w:firstColumn="0" w:lastColumn="0" w:oddVBand="0" w:evenVBand="0" w:oddHBand="0" w:evenHBand="0" w:firstRowFirstColumn="0" w:firstRowLastColumn="0" w:lastRowFirstColumn="0" w:lastRowLastColumn="0"/>
+              <w:rPr>
+                <w:lang w:val="en-NZ"/>
+              </w:rPr>
+            </w:pPr>
+            <w:r>
+              <w:rPr>
+                <w:rFonts w:ascii="Segoe UI" w:hAnsi="Segoe UI" w:cs="Segoe UI"/>
+                <w:color w:val="1F2328"/>
+                <w:shd w:val="clear" w:color="auto" w:fill="FFFFFF"/>
+                <w:lang w:val="en-NZ"/>
+              </w:rPr>
+              <w:t xml:space="preserve">Put a digital object </w:t>
+            </w:r>
+            <w:r>
+              <w:rPr>
+                <w:rFonts w:ascii="Segoe UI" w:hAnsi="Segoe UI" w:cs="Segoe UI"/>
+                <w:color w:val="1F2328"/>
+                <w:shd w:val="clear" w:color="auto" w:fill="FFFFFF"/>
+                <w:lang w:val="en-NZ"/>
+              </w:rPr>
+              <w:t>from a</w:t>
+            </w:r>
+            <w:r>
+              <w:rPr>
+                <w:rFonts w:ascii="Segoe UI" w:hAnsi="Segoe UI" w:cs="Segoe UI"/>
+                <w:color w:val="1F2328"/>
+                <w:shd w:val="clear" w:color="auto" w:fill="FFFFFF"/>
+                <w:lang w:val="en-NZ"/>
+              </w:rPr>
+              <w:t xml:space="preserve"> private space</w:t>
+            </w:r>
+            <w:r>
+              <w:rPr>
+                <w:rFonts w:ascii="Segoe UI" w:hAnsi="Segoe UI" w:cs="Segoe UI"/>
+                <w:color w:val="1F2328"/>
+                <w:shd w:val="clear" w:color="auto" w:fill="FFFFFF"/>
+                <w:lang w:val="en-NZ"/>
+              </w:rPr>
+              <w:t xml:space="preserve"> </w:t>
+            </w:r>
+            <w:r>
+              <w:rPr>
+                <w:rFonts w:ascii="Segoe UI" w:hAnsi="Segoe UI" w:cs="Segoe UI"/>
+                <w:color w:val="1F2328"/>
+                <w:shd w:val="clear" w:color="auto" w:fill="FFFFFF"/>
+                <w:lang w:val="en-NZ"/>
+              </w:rPr>
+              <w:t>in</w:t>
+            </w:r>
+            <w:r>
+              <w:rPr>
+                <w:rFonts w:ascii="Segoe UI" w:hAnsi="Segoe UI" w:cs="Segoe UI"/>
+                <w:color w:val="1F2328"/>
+                <w:shd w:val="clear" w:color="auto" w:fill="FFFFFF"/>
+                <w:lang w:val="en-NZ"/>
+              </w:rPr>
+              <w:t>to</w:t>
+            </w:r>
+            <w:r>
+              <w:rPr>
+                <w:rFonts w:ascii="Segoe UI" w:hAnsi="Segoe UI" w:cs="Segoe UI"/>
+                <w:color w:val="1F2328"/>
+                <w:shd w:val="clear" w:color="auto" w:fill="FFFFFF"/>
+                <w:lang w:val="en-NZ"/>
+              </w:rPr>
+              <w:t xml:space="preserve"> </w:t>
+            </w:r>
+            <w:r>
+              <w:rPr>
+                <w:rFonts w:ascii="Segoe UI" w:hAnsi="Segoe UI" w:cs="Segoe UI"/>
+                <w:color w:val="1F2328"/>
+                <w:shd w:val="clear" w:color="auto" w:fill="FFFFFF"/>
+                <w:lang w:val="en-NZ"/>
+              </w:rPr>
+              <w:t>a</w:t>
+            </w:r>
+            <w:r>
+              <w:rPr>
+                <w:rFonts w:ascii="Segoe UI" w:hAnsi="Segoe UI" w:cs="Segoe UI"/>
+                <w:color w:val="1F2328"/>
+                <w:shd w:val="clear" w:color="auto" w:fill="FFFFFF"/>
+                <w:lang w:val="en-NZ"/>
+              </w:rPr>
+              <w:t xml:space="preserve"> shared one</w:t>
+            </w:r>
+          </w:p>
+        </w:tc>
+      </w:tr>
+      <w:tr>
+        <w:tc>
+          <w:tcPr>
+            <w:cnfStyle w:val="001000000000" w:firstRow="0" w:lastRow="0" w:firstColumn="1" w:lastColumn="0" w:oddVBand="0" w:evenVBand="0" w:oddHBand="0" w:evenHBand="0" w:firstRowFirstColumn="0" w:firstRowLastColumn="0" w:lastRowFirstColumn="0" w:lastRowLastColumn="0"/>
+            <w:tcW w:w="980" w:type="dxa"/>
+          </w:tcPr>
+          <w:p>
+            <w:pPr>
+              <w:jc w:val="center"/>
+              <w:rPr>
+                <w:b w:val="0"/>
+                <w:bCs w:val="0"/>
+                <w:lang w:val="en-NZ"/>
+              </w:rPr>
+            </w:pPr>
+            <w:r>
+              <w:rPr>
+                <w:b w:val="0"/>
+                <w:bCs w:val="0"/>
+                <w:lang w:val="en-NZ"/>
+              </w:rPr>
+              <w:t xml:space="preserve">Task </w:t>
+            </w:r>
+            <w:r>
+              <w:rPr>
+                <w:b w:val="0"/>
+                <w:bCs w:val="0"/>
+                <w:lang w:val="en-NZ"/>
+              </w:rPr>
+              <w:t>9</w:t>
+            </w:r>
+          </w:p>
+        </w:tc>
+        <w:tc>
+          <w:tcPr>
+            <w:tcW w:w="2165" w:type="dxa"/>
+          </w:tcPr>
+          <w:p>
+            <w:pPr>
+              <w:cnfStyle w:val="000000000000" w:firstRow="0" w:lastRow="0" w:firstColumn="0" w:lastColumn="0" w:oddVBand="0" w:evenVBand="0" w:oddHBand="0" w:evenHBand="0" w:firstRowFirstColumn="0" w:firstRowLastColumn="0" w:lastRowFirstColumn="0" w:lastRowLastColumn="0"/>
+              <w:rPr>
+                <w:lang w:val="en-NZ"/>
+              </w:rPr>
+            </w:pPr>
+            <w:r>
+              <w:rPr>
+                <w:lang w:val="en-NZ"/>
+              </w:rPr>
+              <w:t>Vote for an option in a menu</w:t>
+            </w:r>
+          </w:p>
+        </w:tc>
+        <w:tc>
+          <w:tcPr>
+            <w:tcW w:w="5639" w:type="dxa"/>
+          </w:tcPr>
+          <w:p>
+            <w:pPr>
+              <w:cnfStyle w:val="000000000000" w:firstRow="0" w:lastRow="0" w:firstColumn="0" w:lastColumn="0" w:oddVBand="0" w:evenVBand="0" w:oddHBand="0" w:evenHBand="0" w:firstRowFirstColumn="0" w:firstRowLastColumn="0" w:lastRowFirstColumn="0" w:lastRowLastColumn="0"/>
+              <w:rPr>
+                <w:lang w:val="en-NZ"/>
+              </w:rPr>
+            </w:pPr>
+            <w:r>
+              <w:rPr>
+                <w:lang w:val="en-NZ"/>
+              </w:rPr>
+              <w:t>Vote or select an option from a menu-like user interface</w:t>
+            </w:r>
+          </w:p>
+        </w:tc>
+      </w:tr>
+      <w:tr>
+        <w:tc>
+          <w:tcPr>
+            <w:cnfStyle w:val="001000000000" w:firstRow="0" w:lastRow="0" w:firstColumn="1" w:lastColumn="0" w:oddVBand="0" w:evenVBand="0" w:oddHBand="0" w:evenHBand="0" w:firstRowFirstColumn="0" w:firstRowLastColumn="0" w:lastRowFirstColumn="0" w:lastRowLastColumn="0"/>
+            <w:tcW w:w="980" w:type="dxa"/>
+          </w:tcPr>
+          <w:p>
+            <w:pPr>
+              <w:jc w:val="center"/>
+              <w:rPr>
+                <w:b w:val="0"/>
+                <w:bCs w:val="0"/>
+                <w:lang w:val="en-NZ"/>
+              </w:rPr>
+            </w:pPr>
+            <w:r>
+              <w:rPr>
+                <w:b w:val="0"/>
+                <w:bCs w:val="0"/>
+                <w:lang w:val="en-NZ"/>
+              </w:rPr>
+              <w:t xml:space="preserve">Task </w:t>
+            </w:r>
+            <w:r>
+              <w:rPr>
+                <w:b w:val="0"/>
+                <w:bCs w:val="0"/>
+                <w:lang w:val="en-NZ"/>
+              </w:rPr>
+              <w:t>10</w:t>
+            </w:r>
+          </w:p>
+        </w:tc>
+        <w:tc>
+          <w:tcPr>
+            <w:tcW w:w="2165" w:type="dxa"/>
+          </w:tcPr>
+          <w:p>
+            <w:pPr>
+              <w:cnfStyle w:val="000000000000" w:firstRow="0" w:lastRow="0" w:firstColumn="0" w:lastColumn="0" w:oddVBand="0" w:evenVBand="0" w:oddHBand="0" w:evenHBand="0" w:firstRowFirstColumn="0" w:firstRowLastColumn="0" w:lastRowFirstColumn="0" w:lastRowLastColumn="0"/>
+              <w:rPr>
+                <w:lang w:val="en-NZ"/>
+              </w:rPr>
+            </w:pPr>
+            <w:r>
+              <w:rPr>
+                <w:lang w:val="en-NZ"/>
+              </w:rPr>
+              <w:t>Vote for an option in a collection of objects</w:t>
+            </w:r>
+          </w:p>
+        </w:tc>
+        <w:tc>
+          <w:tcPr>
+            <w:tcW w:w="5639" w:type="dxa"/>
+          </w:tcPr>
+          <w:p>
+            <w:pPr>
+              <w:cnfStyle w:val="000000000000" w:firstRow="0" w:lastRow="0" w:firstColumn="0" w:lastColumn="0" w:oddVBand="0" w:evenVBand="0" w:oddHBand="0" w:evenHBand="0" w:firstRowFirstColumn="0" w:firstRowLastColumn="0" w:lastRowFirstColumn="0" w:lastRowLastColumn="0"/>
+              <w:rPr>
+                <w:lang w:val="en-NZ"/>
+              </w:rPr>
+            </w:pPr>
+            <w:r>
+              <w:rPr>
+                <w:lang w:val="en-NZ"/>
+              </w:rPr>
+              <w:t>Vote or select an option from a collection of objects present in the shared space</w:t>
+            </w:r>
+          </w:p>
+          <w:p>
+            <w:pPr>
+              <w:ind w:firstLine="708"/>
+              <w:cnfStyle w:val="000000000000" w:firstRow="0" w:lastRow="0" w:firstColumn="0" w:lastColumn="0" w:oddVBand="0" w:evenVBand="0" w:oddHBand="0" w:evenHBand="0" w:firstRowFirstColumn="0" w:firstRowLastColumn="0" w:lastRowFirstColumn="0" w:lastRowLastColumn="0"/>
+              <w:rPr>
+                <w:lang w:val="en-NZ"/>
+              </w:rPr>
+            </w:pPr>
+          </w:p>
+        </w:tc>
+      </w:tr>
+      <w:tr>
+        <w:tc>
+          <w:tcPr>
+            <w:cnfStyle w:val="001000000000" w:firstRow="0" w:lastRow="0" w:firstColumn="1" w:lastColumn="0" w:oddVBand="0" w:evenVBand="0" w:oddHBand="0" w:evenHBand="0" w:firstRowFirstColumn="0" w:firstRowLastColumn="0" w:lastRowFirstColumn="0" w:lastRowLastColumn="0"/>
+            <w:tcW w:w="980" w:type="dxa"/>
+          </w:tcPr>
+          <w:p>
+            <w:pPr>
+              <w:jc w:val="center"/>
+              <w:rPr>
+                <w:b w:val="0"/>
+                <w:bCs w:val="0"/>
+                <w:lang w:val="en-NZ"/>
+              </w:rPr>
+            </w:pPr>
+            <w:r>
+              <w:rPr>
+                <w:b w:val="0"/>
+                <w:bCs w:val="0"/>
+                <w:lang w:val="en-NZ"/>
+              </w:rPr>
+              <w:t xml:space="preserve">Task </w:t>
+            </w:r>
+            <w:r>
+              <w:rPr>
+                <w:b w:val="0"/>
+                <w:bCs w:val="0"/>
+                <w:lang w:val="en-NZ"/>
+              </w:rPr>
+              <w:t>11</w:t>
+            </w:r>
+          </w:p>
+        </w:tc>
+        <w:tc>
+          <w:tcPr>
+            <w:tcW w:w="2165" w:type="dxa"/>
+          </w:tcPr>
+          <w:p>
+            <w:pPr>
+              <w:cnfStyle w:val="000000000000" w:firstRow="0" w:lastRow="0" w:firstColumn="0" w:lastColumn="0" w:oddVBand="0" w:evenVBand="0" w:oddHBand="0" w:evenHBand="0" w:firstRowFirstColumn="0" w:firstRowLastColumn="0" w:lastRowFirstColumn="0" w:lastRowLastColumn="0"/>
+              <w:rPr>
+                <w:lang w:val="en-NZ"/>
+              </w:rPr>
+            </w:pPr>
+            <w:r>
+              <w:rPr>
+                <w:lang w:val="en-NZ"/>
+              </w:rPr>
+              <w:t xml:space="preserve">Ask for </w:t>
+            </w:r>
+            <w:r>
+              <w:rPr>
+                <w:lang w:val="en-NZ"/>
+              </w:rPr>
+              <w:t>the attention of one teammate</w:t>
+            </w:r>
+          </w:p>
+        </w:tc>
+        <w:tc>
+          <w:tcPr>
+            <w:tcW w:w="5639" w:type="dxa"/>
+          </w:tcPr>
+          <w:p>
+            <w:pPr>
+              <w:cnfStyle w:val="000000000000" w:firstRow="0" w:lastRow="0" w:firstColumn="0" w:lastColumn="0" w:oddVBand="0" w:evenVBand="0" w:oddHBand="0" w:evenHBand="0" w:firstRowFirstColumn="0" w:firstRowLastColumn="0" w:lastRowFirstColumn="0" w:lastRowLastColumn="0"/>
+              <w:rPr>
+                <w:lang w:val="en-NZ"/>
+              </w:rPr>
+            </w:pPr>
+            <w:r>
+              <w:rPr>
+                <w:lang w:val="en-NZ"/>
+              </w:rPr>
+              <w:t>Ask for one or more of your teammates to pay attention to you</w:t>
+            </w:r>
+          </w:p>
+        </w:tc>
+      </w:tr>
+      <w:tr>
+        <w:tc>
+          <w:tcPr>
+            <w:cnfStyle w:val="001000000000" w:firstRow="0" w:lastRow="0" w:firstColumn="1" w:lastColumn="0" w:oddVBand="0" w:evenVBand="0" w:oddHBand="0" w:evenHBand="0" w:firstRowFirstColumn="0" w:firstRowLastColumn="0" w:lastRowFirstColumn="0" w:lastRowLastColumn="0"/>
+            <w:tcW w:w="980" w:type="dxa"/>
+          </w:tcPr>
+          <w:p>
+            <w:pPr>
+              <w:jc w:val="center"/>
+              <w:rPr>
+                <w:b w:val="0"/>
+                <w:bCs w:val="0"/>
+                <w:lang w:val="en-NZ"/>
+              </w:rPr>
+            </w:pPr>
+            <w:r>
+              <w:rPr>
+                <w:b w:val="0"/>
+                <w:bCs w:val="0"/>
+                <w:lang w:val="en-NZ"/>
+              </w:rPr>
+              <w:t xml:space="preserve">Task </w:t>
+            </w:r>
+            <w:r>
+              <w:rPr>
+                <w:b w:val="0"/>
+                <w:bCs w:val="0"/>
+                <w:lang w:val="en-NZ"/>
+              </w:rPr>
+              <w:t>12</w:t>
+            </w:r>
+          </w:p>
+        </w:tc>
+        <w:tc>
+          <w:tcPr>
+            <w:tcW w:w="2165" w:type="dxa"/>
+          </w:tcPr>
+          <w:p>
+            <w:pPr>
+              <w:cnfStyle w:val="000000000000" w:firstRow="0" w:lastRow="0" w:firstColumn="0" w:lastColumn="0" w:oddVBand="0" w:evenVBand="0" w:oddHBand="0" w:evenHBand="0" w:firstRowFirstColumn="0" w:firstRowLastColumn="0" w:lastRowFirstColumn="0" w:lastRowLastColumn="0"/>
+              <w:rPr>
+                <w:lang w:val="en-NZ"/>
+              </w:rPr>
+            </w:pPr>
+            <w:r>
+              <w:rPr>
+                <w:lang w:val="en-NZ"/>
+              </w:rPr>
+              <w:t>Pause participation</w:t>
+            </w:r>
+          </w:p>
+        </w:tc>
+        <w:tc>
+          <w:tcPr>
+            <w:tcW w:w="5639" w:type="dxa"/>
+          </w:tcPr>
+          <w:p>
+            <w:pPr>
+              <w:cnfStyle w:val="000000000000" w:firstRow="0" w:lastRow="0" w:firstColumn="0" w:lastColumn="0" w:oddVBand="0" w:evenVBand="0" w:oddHBand="0" w:evenHBand="0" w:firstRowFirstColumn="0" w:firstRowLastColumn="0" w:lastRowFirstColumn="0" w:lastRowLastColumn="0"/>
+              <w:rPr>
+                <w:lang w:val="en-NZ"/>
+              </w:rPr>
+            </w:pPr>
+            <w:r>
+              <w:rPr>
+                <w:lang w:val="en-NZ"/>
+              </w:rPr>
+              <w:t>Pause your current participation in the group’s activities</w:t>
+            </w:r>
+          </w:p>
+        </w:tc>
+      </w:tr>
+      <w:tr>
+        <w:tc>
+          <w:tcPr>
+            <w:cnfStyle w:val="001000000000" w:firstRow="0" w:lastRow="0" w:firstColumn="1" w:lastColumn="0" w:oddVBand="0" w:evenVBand="0" w:oddHBand="0" w:evenHBand="0" w:firstRowFirstColumn="0" w:firstRowLastColumn="0" w:lastRowFirstColumn="0" w:lastRowLastColumn="0"/>
+            <w:tcW w:w="980" w:type="dxa"/>
+          </w:tcPr>
+          <w:p>
+            <w:pPr>
+              <w:jc w:val="center"/>
+              <w:rPr>
+                <w:b w:val="0"/>
+                <w:bCs w:val="0"/>
+                <w:lang w:val="en-NZ"/>
+              </w:rPr>
+            </w:pPr>
+            <w:r>
+              <w:rPr>
+                <w:b w:val="0"/>
+                <w:bCs w:val="0"/>
+                <w:lang w:val="en-NZ"/>
+              </w:rPr>
+              <w:t xml:space="preserve">Task </w:t>
+            </w:r>
+            <w:r>
+              <w:rPr>
+                <w:b w:val="0"/>
+                <w:bCs w:val="0"/>
+                <w:lang w:val="en-NZ"/>
+              </w:rPr>
+              <w:t>13</w:t>
+            </w:r>
+          </w:p>
+        </w:tc>
+        <w:tc>
+          <w:tcPr>
+            <w:tcW w:w="2165" w:type="dxa"/>
+          </w:tcPr>
+          <w:p>
+            <w:pPr>
+              <w:cnfStyle w:val="000000000000" w:firstRow="0" w:lastRow="0" w:firstColumn="0" w:lastColumn="0" w:oddVBand="0" w:evenVBand="0" w:oddHBand="0" w:evenHBand="0" w:firstRowFirstColumn="0" w:firstRowLastColumn="0" w:lastRowFirstColumn="0" w:lastRowLastColumn="0"/>
+              <w:rPr>
+                <w:lang w:val="en-NZ"/>
+              </w:rPr>
+            </w:pPr>
+            <w:r>
+              <w:rPr>
+                <w:lang w:val="en-NZ"/>
+              </w:rPr>
+              <w:t xml:space="preserve">Give </w:t>
+            </w:r>
+            <w:r>
+              <w:rPr>
+                <w:lang w:val="en-NZ"/>
+              </w:rPr>
+              <w:t xml:space="preserve">someone else the </w:t>
+            </w:r>
+            <w:r>
+              <w:rPr>
+                <w:lang w:val="en-NZ"/>
+              </w:rPr>
+              <w:t>turn to speak</w:t>
+            </w:r>
+          </w:p>
+        </w:tc>
+        <w:tc>
+          <w:tcPr>
+            <w:tcW w:w="5639" w:type="dxa"/>
+          </w:tcPr>
+          <w:p>
+            <w:pPr>
+              <w:cnfStyle w:val="000000000000" w:firstRow="0" w:lastRow="0" w:firstColumn="0" w:lastColumn="0" w:oddVBand="0" w:evenVBand="0" w:oddHBand="0" w:evenHBand="0" w:firstRowFirstColumn="0" w:firstRowLastColumn="0" w:lastRowFirstColumn="0" w:lastRowLastColumn="0"/>
+              <w:rPr>
+                <w:lang w:val="en-NZ"/>
+              </w:rPr>
+            </w:pPr>
+            <w:r>
+              <w:rPr>
+                <w:lang w:val="en-NZ"/>
+              </w:rPr>
+              <w:t>Give a teammate the turn to speak when asking for it</w:t>
+            </w:r>
+          </w:p>
+        </w:tc>
+      </w:tr>
+      <w:tr>
+        <w:tc>
+          <w:tcPr>
+            <w:cnfStyle w:val="001000000000" w:firstRow="0" w:lastRow="0" w:firstColumn="1" w:lastColumn="0" w:oddVBand="0" w:evenVBand="0" w:oddHBand="0" w:evenHBand="0" w:firstRowFirstColumn="0" w:firstRowLastColumn="0" w:lastRowFirstColumn="0" w:lastRowLastColumn="0"/>
+            <w:tcW w:w="980" w:type="dxa"/>
+          </w:tcPr>
+          <w:p>
+            <w:pPr>
+              <w:jc w:val="center"/>
+              <w:rPr>
+                <w:b w:val="0"/>
+                <w:bCs w:val="0"/>
+                <w:lang w:val="en-NZ"/>
+              </w:rPr>
+            </w:pPr>
+            <w:r>
+              <w:rPr>
+                <w:b w:val="0"/>
+                <w:bCs w:val="0"/>
+                <w:lang w:val="en-NZ"/>
+              </w:rPr>
+              <w:t xml:space="preserve">Task </w:t>
+            </w:r>
+            <w:r>
+              <w:rPr>
+                <w:b w:val="0"/>
+                <w:bCs w:val="0"/>
+                <w:lang w:val="en-NZ"/>
+              </w:rPr>
+              <w:t>14</w:t>
+            </w:r>
+          </w:p>
+        </w:tc>
+        <w:tc>
+          <w:tcPr>
+            <w:tcW w:w="2165" w:type="dxa"/>
+          </w:tcPr>
+          <w:p>
+            <w:pPr>
+              <w:cnfStyle w:val="000000000000" w:firstRow="0" w:lastRow="0" w:firstColumn="0" w:lastColumn="0" w:oddVBand="0" w:evenVBand="0" w:oddHBand="0" w:evenHBand="0" w:firstRowFirstColumn="0" w:firstRowLastColumn="0" w:lastRowFirstColumn="0" w:lastRowLastColumn="0"/>
+              <w:rPr>
+                <w:lang w:val="en-NZ"/>
+              </w:rPr>
+            </w:pPr>
+            <w:r>
+              <w:rPr>
+                <w:lang w:val="en-NZ"/>
+              </w:rPr>
+              <w:t>Ask for everyone's attention</w:t>
+            </w:r>
+          </w:p>
+        </w:tc>
+        <w:tc>
+          <w:tcPr>
+            <w:tcW w:w="5639" w:type="dxa"/>
+          </w:tcPr>
+          <w:p>
+            <w:pPr>
+              <w:cnfStyle w:val="000000000000" w:firstRow="0" w:lastRow="0" w:firstColumn="0" w:lastColumn="0" w:oddVBand="0" w:evenVBand="0" w:oddHBand="0" w:evenHBand="0" w:firstRowFirstColumn="0" w:firstRowLastColumn="0" w:lastRowFirstColumn="0" w:lastRowLastColumn="0"/>
+              <w:rPr>
+                <w:lang w:val="en-NZ"/>
+              </w:rPr>
+            </w:pPr>
+            <w:r>
+              <w:rPr>
+                <w:lang w:val="en-NZ"/>
+              </w:rPr>
+              <w:t>Ask for all the participants of an activity to pay attention to you</w:t>
+            </w:r>
+          </w:p>
+        </w:tc>
+      </w:tr>
+    </w:tbl>
+    <w:p>
+      <w:pPr>
+        <w:rPr>
+          <w:lang w:val="en-NZ"/>
+        </w:rPr>
+      </w:pPr>
+    </w:p>
+    <w:p>
+      <w:pPr>
+        <w:rPr>
+          <w:lang w:val="en-NZ"/>
+        </w:rPr>
+      </w:pPr>
+      <w:r>
+        <w:rPr>
+          <w:lang w:val="en-NZ"/>
+        </w:rPr>
+        <w:t>All the videoclips represent a gesture proposed by one or more interviewed participants. Each video is coded as TXGY where X represents the ID of the task and Y the ID of the gesture represented. Al clips are a reinterpretation of the gestures observed as proposed by the researcher.</w:t>
+      </w:r>
     </w:p>
     <w:sectPr>
       <w:pgSz w:w="12240" w:h="15840"/>
@@ -8141,7 +9581,7 @@
 </file>
 
 <file path=word/styles.xml><?xml version="1.0" encoding="utf-8"?>
-<w:styles xmlns:mc="http://schemas.openxmlformats.org/markup-compatibility/2006" xmlns:r="http://schemas.openxmlformats.org/officeDocument/2006/relationships" xmlns:w="http://schemas.openxmlformats.org/wordprocessingml/2006/main" xmlns:w14="http://schemas.microsoft.com/office/word/2010/wordml" xmlns:w15="http://schemas.microsoft.com/office/word/2012/wordml" xmlns:w16cex="http://schemas.microsoft.com/office/word/2018/wordml/cex" xmlns:w16cid="http://schemas.microsoft.com/office/word/2016/wordml/cid" xmlns:w16="http://schemas.microsoft.com/office/word/2018/wordml" xmlns:w16du="http://schemas.microsoft.com/office/word/2023/wordml/word16du" xmlns:w16sdtdh="http://schemas.microsoft.com/office/word/2020/wordml/sdtdatahash" xmlns:w16sdtfl="http://schemas.microsoft.com/office/word/2024/wordml/sdtformatlock" xmlns:w16se="http://schemas.microsoft.com/office/word/2015/wordml/symex" mc:Ignorable="w14 w15 w16se w16cid w16 w16cex w16sdtdh w16sdtfl w16du">
+<w:styles xmlns:mc="http://schemas.openxmlformats.org/markup-compatibility/2006" xmlns:r="http://schemas.openxmlformats.org/officeDocument/2006/relationships" xmlns:w="http://schemas.openxmlformats.org/wordprocessingml/2006/main" xmlns:w14="http://schemas.microsoft.com/office/word/2010/wordml" xmlns:w15="http://schemas.microsoft.com/office/word/2012/wordml" xmlns:w16cex="http://schemas.microsoft.com/office/word/2018/wordml/cex" xmlns:w16cid="http://schemas.microsoft.com/office/word/2016/wordml/cid" xmlns:w16="http://schemas.microsoft.com/office/word/2018/wordml" xmlns:w16sdtdh="http://schemas.microsoft.com/office/word/2020/wordml/sdtdatahash" xmlns:w16se="http://schemas.microsoft.com/office/word/2015/wordml/symex" mc:Ignorable="w14 w15 w16se w16cid w16 w16cex w16sdtdh">
   <w:docDefaults>
     <w:rPrDefault>
       <w:rPr>
@@ -8541,11 +9981,11 @@
     <w:name w:val="Normal"/>
     <w:qFormat/>
   </w:style>
-  <w:style w:type="paragraph" w:styleId="Ttulo1">
+  <w:style w:type="paragraph" w:styleId="Heading1">
     <w:name w:val="heading 1"/>
     <w:basedOn w:val="Normal"/>
     <w:next w:val="Normal"/>
-    <w:link w:val="Ttulo1Car"/>
+    <w:link w:val="Heading1Char"/>
     <w:uiPriority w:val="9"/>
     <w:qFormat/>
     <w:rsid w:val="00F90F28"/>
@@ -8562,11 +10002,11 @@
       <w:szCs w:val="40"/>
     </w:rPr>
   </w:style>
-  <w:style w:type="paragraph" w:styleId="Ttulo2">
+  <w:style w:type="paragraph" w:styleId="Heading2">
     <w:name w:val="heading 2"/>
     <w:basedOn w:val="Normal"/>
     <w:next w:val="Normal"/>
-    <w:link w:val="Ttulo2Car"/>
+    <w:link w:val="Heading2Char"/>
     <w:uiPriority w:val="9"/>
     <w:semiHidden/>
     <w:unhideWhenUsed/>
@@ -8585,11 +10025,11 @@
       <w:szCs w:val="32"/>
     </w:rPr>
   </w:style>
-  <w:style w:type="paragraph" w:styleId="Ttulo3">
+  <w:style w:type="paragraph" w:styleId="Heading3">
     <w:name w:val="heading 3"/>
     <w:basedOn w:val="Normal"/>
     <w:next w:val="Normal"/>
-    <w:link w:val="Ttulo3Car"/>
+    <w:link w:val="Heading3Char"/>
     <w:uiPriority w:val="9"/>
     <w:semiHidden/>
     <w:unhideWhenUsed/>
@@ -8608,11 +10048,11 @@
       <w:szCs w:val="28"/>
     </w:rPr>
   </w:style>
-  <w:style w:type="paragraph" w:styleId="Ttulo4">
+  <w:style w:type="paragraph" w:styleId="Heading4">
     <w:name w:val="heading 4"/>
     <w:basedOn w:val="Normal"/>
     <w:next w:val="Normal"/>
-    <w:link w:val="Ttulo4Car"/>
+    <w:link w:val="Heading4Char"/>
     <w:uiPriority w:val="9"/>
     <w:semiHidden/>
     <w:unhideWhenUsed/>
@@ -8631,11 +10071,11 @@
       <w:color w:val="0F4761" w:themeColor="accent1" w:themeShade="BF"/>
     </w:rPr>
   </w:style>
-  <w:style w:type="paragraph" w:styleId="Ttulo5">
+  <w:style w:type="paragraph" w:styleId="Heading5">
     <w:name w:val="heading 5"/>
     <w:basedOn w:val="Normal"/>
     <w:next w:val="Normal"/>
-    <w:link w:val="Ttulo5Car"/>
+    <w:link w:val="Heading5Char"/>
     <w:uiPriority w:val="9"/>
     <w:semiHidden/>
     <w:unhideWhenUsed/>
@@ -8652,11 +10092,11 @@
       <w:color w:val="0F4761" w:themeColor="accent1" w:themeShade="BF"/>
     </w:rPr>
   </w:style>
-  <w:style w:type="paragraph" w:styleId="Ttulo6">
+  <w:style w:type="paragraph" w:styleId="Heading6">
     <w:name w:val="heading 6"/>
     <w:basedOn w:val="Normal"/>
     <w:next w:val="Normal"/>
-    <w:link w:val="Ttulo6Car"/>
+    <w:link w:val="Heading6Char"/>
     <w:uiPriority w:val="9"/>
     <w:semiHidden/>
     <w:unhideWhenUsed/>
@@ -8675,11 +10115,11 @@
       <w:color w:val="595959" w:themeColor="text1" w:themeTint="A6"/>
     </w:rPr>
   </w:style>
-  <w:style w:type="paragraph" w:styleId="Ttulo7">
+  <w:style w:type="paragraph" w:styleId="Heading7">
     <w:name w:val="heading 7"/>
     <w:basedOn w:val="Normal"/>
     <w:next w:val="Normal"/>
-    <w:link w:val="Ttulo7Car"/>
+    <w:link w:val="Heading7Char"/>
     <w:uiPriority w:val="9"/>
     <w:semiHidden/>
     <w:unhideWhenUsed/>
@@ -8696,11 +10136,11 @@
       <w:color w:val="595959" w:themeColor="text1" w:themeTint="A6"/>
     </w:rPr>
   </w:style>
-  <w:style w:type="paragraph" w:styleId="Ttulo8">
+  <w:style w:type="paragraph" w:styleId="Heading8">
     <w:name w:val="heading 8"/>
     <w:basedOn w:val="Normal"/>
     <w:next w:val="Normal"/>
-    <w:link w:val="Ttulo8Car"/>
+    <w:link w:val="Heading8Char"/>
     <w:uiPriority w:val="9"/>
     <w:semiHidden/>
     <w:unhideWhenUsed/>
@@ -8719,11 +10159,11 @@
       <w:color w:val="272727" w:themeColor="text1" w:themeTint="D8"/>
     </w:rPr>
   </w:style>
-  <w:style w:type="paragraph" w:styleId="Ttulo9">
+  <w:style w:type="paragraph" w:styleId="Heading9">
     <w:name w:val="heading 9"/>
     <w:basedOn w:val="Normal"/>
     <w:next w:val="Normal"/>
-    <w:link w:val="Ttulo9Car"/>
+    <w:link w:val="Heading9Char"/>
     <w:uiPriority w:val="9"/>
     <w:semiHidden/>
     <w:unhideWhenUsed/>
@@ -8740,13 +10180,13 @@
       <w:color w:val="272727" w:themeColor="text1" w:themeTint="D8"/>
     </w:rPr>
   </w:style>
-  <w:style w:type="character" w:default="1" w:styleId="Fuentedeprrafopredeter">
+  <w:style w:type="character" w:default="1" w:styleId="DefaultParagraphFont">
     <w:name w:val="Default Paragraph Font"/>
     <w:uiPriority w:val="1"/>
     <w:semiHidden/>
     <w:unhideWhenUsed/>
   </w:style>
-  <w:style w:type="table" w:default="1" w:styleId="Tablanormal">
+  <w:style w:type="table" w:default="1" w:styleId="TableNormal">
     <w:name w:val="Normal Table"/>
     <w:uiPriority w:val="99"/>
     <w:semiHidden/>
@@ -8761,16 +10201,16 @@
       </w:tblCellMar>
     </w:tblPr>
   </w:style>
-  <w:style w:type="numbering" w:default="1" w:styleId="Sinlista">
+  <w:style w:type="numbering" w:default="1" w:styleId="NoList">
     <w:name w:val="No List"/>
     <w:uiPriority w:val="99"/>
     <w:semiHidden/>
     <w:unhideWhenUsed/>
   </w:style>
-  <w:style w:type="character" w:customStyle="1" w:styleId="Ttulo1Car">
-    <w:name w:val="Título 1 Car"/>
-    <w:basedOn w:val="Fuentedeprrafopredeter"/>
-    <w:link w:val="Ttulo1"/>
+  <w:style w:type="character" w:customStyle="1" w:styleId="Heading1Char">
+    <w:name w:val="Heading 1 Char"/>
+    <w:basedOn w:val="DefaultParagraphFont"/>
+    <w:link w:val="Heading1"/>
     <w:uiPriority w:val="9"/>
     <w:rsid w:val="00F90F28"/>
     <w:rPr>
@@ -8780,10 +10220,10 @@
       <w:szCs w:val="40"/>
     </w:rPr>
   </w:style>
-  <w:style w:type="character" w:customStyle="1" w:styleId="Ttulo2Car">
-    <w:name w:val="Título 2 Car"/>
-    <w:basedOn w:val="Fuentedeprrafopredeter"/>
-    <w:link w:val="Ttulo2"/>
+  <w:style w:type="character" w:customStyle="1" w:styleId="Heading2Char">
+    <w:name w:val="Heading 2 Char"/>
+    <w:basedOn w:val="DefaultParagraphFont"/>
+    <w:link w:val="Heading2"/>
     <w:uiPriority w:val="9"/>
     <w:semiHidden/>
     <w:rsid w:val="00F90F28"/>
@@ -8794,10 +10234,10 @@
       <w:szCs w:val="32"/>
     </w:rPr>
   </w:style>
-  <w:style w:type="character" w:customStyle="1" w:styleId="Ttulo3Car">
-    <w:name w:val="Título 3 Car"/>
-    <w:basedOn w:val="Fuentedeprrafopredeter"/>
-    <w:link w:val="Ttulo3"/>
+  <w:style w:type="character" w:customStyle="1" w:styleId="Heading3Char">
+    <w:name w:val="Heading 3 Char"/>
+    <w:basedOn w:val="DefaultParagraphFont"/>
+    <w:link w:val="Heading3"/>
     <w:uiPriority w:val="9"/>
     <w:semiHidden/>
     <w:rsid w:val="00F90F28"/>
@@ -8808,10 +10248,10 @@
       <w:szCs w:val="28"/>
     </w:rPr>
   </w:style>
-  <w:style w:type="character" w:customStyle="1" w:styleId="Ttulo4Car">
-    <w:name w:val="Título 4 Car"/>
-    <w:basedOn w:val="Fuentedeprrafopredeter"/>
-    <w:link w:val="Ttulo4"/>
+  <w:style w:type="character" w:customStyle="1" w:styleId="Heading4Char">
+    <w:name w:val="Heading 4 Char"/>
+    <w:basedOn w:val="DefaultParagraphFont"/>
+    <w:link w:val="Heading4"/>
     <w:uiPriority w:val="9"/>
     <w:semiHidden/>
     <w:rsid w:val="00F90F28"/>
@@ -8822,10 +10262,10 @@
       <w:color w:val="0F4761" w:themeColor="accent1" w:themeShade="BF"/>
     </w:rPr>
   </w:style>
-  <w:style w:type="character" w:customStyle="1" w:styleId="Ttulo5Car">
-    <w:name w:val="Título 5 Car"/>
-    <w:basedOn w:val="Fuentedeprrafopredeter"/>
-    <w:link w:val="Ttulo5"/>
+  <w:style w:type="character" w:customStyle="1" w:styleId="Heading5Char">
+    <w:name w:val="Heading 5 Char"/>
+    <w:basedOn w:val="DefaultParagraphFont"/>
+    <w:link w:val="Heading5"/>
     <w:uiPriority w:val="9"/>
     <w:semiHidden/>
     <w:rsid w:val="00F90F28"/>
@@ -8834,10 +10274,10 @@
       <w:color w:val="0F4761" w:themeColor="accent1" w:themeShade="BF"/>
     </w:rPr>
   </w:style>
-  <w:style w:type="character" w:customStyle="1" w:styleId="Ttulo6Car">
-    <w:name w:val="Título 6 Car"/>
-    <w:basedOn w:val="Fuentedeprrafopredeter"/>
-    <w:link w:val="Ttulo6"/>
+  <w:style w:type="character" w:customStyle="1" w:styleId="Heading6Char">
+    <w:name w:val="Heading 6 Char"/>
+    <w:basedOn w:val="DefaultParagraphFont"/>
+    <w:link w:val="Heading6"/>
     <w:uiPriority w:val="9"/>
     <w:semiHidden/>
     <w:rsid w:val="00F90F28"/>
@@ -8848,10 +10288,10 @@
       <w:color w:val="595959" w:themeColor="text1" w:themeTint="A6"/>
     </w:rPr>
   </w:style>
-  <w:style w:type="character" w:customStyle="1" w:styleId="Ttulo7Car">
-    <w:name w:val="Título 7 Car"/>
-    <w:basedOn w:val="Fuentedeprrafopredeter"/>
-    <w:link w:val="Ttulo7"/>
+  <w:style w:type="character" w:customStyle="1" w:styleId="Heading7Char">
+    <w:name w:val="Heading 7 Char"/>
+    <w:basedOn w:val="DefaultParagraphFont"/>
+    <w:link w:val="Heading7"/>
     <w:uiPriority w:val="9"/>
     <w:semiHidden/>
     <w:rsid w:val="00F90F28"/>
@@ -8860,10 +10300,10 @@
       <w:color w:val="595959" w:themeColor="text1" w:themeTint="A6"/>
     </w:rPr>
   </w:style>
-  <w:style w:type="character" w:customStyle="1" w:styleId="Ttulo8Car">
-    <w:name w:val="Título 8 Car"/>
-    <w:basedOn w:val="Fuentedeprrafopredeter"/>
-    <w:link w:val="Ttulo8"/>
+  <w:style w:type="character" w:customStyle="1" w:styleId="Heading8Char">
+    <w:name w:val="Heading 8 Char"/>
+    <w:basedOn w:val="DefaultParagraphFont"/>
+    <w:link w:val="Heading8"/>
     <w:uiPriority w:val="9"/>
     <w:semiHidden/>
     <w:rsid w:val="00F90F28"/>
@@ -8874,10 +10314,10 @@
       <w:color w:val="272727" w:themeColor="text1" w:themeTint="D8"/>
     </w:rPr>
   </w:style>
-  <w:style w:type="character" w:customStyle="1" w:styleId="Ttulo9Car">
-    <w:name w:val="Título 9 Car"/>
-    <w:basedOn w:val="Fuentedeprrafopredeter"/>
-    <w:link w:val="Ttulo9"/>
+  <w:style w:type="character" w:customStyle="1" w:styleId="Heading9Char">
+    <w:name w:val="Heading 9 Char"/>
+    <w:basedOn w:val="DefaultParagraphFont"/>
+    <w:link w:val="Heading9"/>
     <w:uiPriority w:val="9"/>
     <w:semiHidden/>
     <w:rsid w:val="00F90F28"/>
@@ -8886,11 +10326,11 @@
       <w:color w:val="272727" w:themeColor="text1" w:themeTint="D8"/>
     </w:rPr>
   </w:style>
-  <w:style w:type="paragraph" w:styleId="Ttulo">
+  <w:style w:type="paragraph" w:styleId="Title">
     <w:name w:val="Title"/>
     <w:basedOn w:val="Normal"/>
     <w:next w:val="Normal"/>
-    <w:link w:val="TtuloCar"/>
+    <w:link w:val="TitleChar"/>
     <w:uiPriority w:val="10"/>
     <w:qFormat/>
     <w:rsid w:val="00F90F28"/>
@@ -8906,10 +10346,10 @@
       <w:szCs w:val="56"/>
     </w:rPr>
   </w:style>
-  <w:style w:type="character" w:customStyle="1" w:styleId="TtuloCar">
-    <w:name w:val="Título Car"/>
-    <w:basedOn w:val="Fuentedeprrafopredeter"/>
-    <w:link w:val="Ttulo"/>
+  <w:style w:type="character" w:customStyle="1" w:styleId="TitleChar">
+    <w:name w:val="Title Char"/>
+    <w:basedOn w:val="DefaultParagraphFont"/>
+    <w:link w:val="Title"/>
     <w:uiPriority w:val="10"/>
     <w:rsid w:val="00F90F28"/>
     <w:rPr>
@@ -8920,11 +10360,11 @@
       <w:szCs w:val="56"/>
     </w:rPr>
   </w:style>
-  <w:style w:type="paragraph" w:styleId="Subttulo">
+  <w:style w:type="paragraph" w:styleId="Subtitle">
     <w:name w:val="Subtitle"/>
     <w:basedOn w:val="Normal"/>
     <w:next w:val="Normal"/>
-    <w:link w:val="SubttuloCar"/>
+    <w:link w:val="SubtitleChar"/>
     <w:uiPriority w:val="11"/>
     <w:qFormat/>
     <w:rsid w:val="00F90F28"/>
@@ -8941,10 +10381,10 @@
       <w:szCs w:val="28"/>
     </w:rPr>
   </w:style>
-  <w:style w:type="character" w:customStyle="1" w:styleId="SubttuloCar">
-    <w:name w:val="Subtítulo Car"/>
-    <w:basedOn w:val="Fuentedeprrafopredeter"/>
-    <w:link w:val="Subttulo"/>
+  <w:style w:type="character" w:customStyle="1" w:styleId="SubtitleChar">
+    <w:name w:val="Subtitle Char"/>
+    <w:basedOn w:val="DefaultParagraphFont"/>
+    <w:link w:val="Subtitle"/>
     <w:uiPriority w:val="11"/>
     <w:rsid w:val="00F90F28"/>
     <w:rPr>
@@ -8955,11 +10395,11 @@
       <w:szCs w:val="28"/>
     </w:rPr>
   </w:style>
-  <w:style w:type="paragraph" w:styleId="Cita">
+  <w:style w:type="paragraph" w:styleId="Quote">
     <w:name w:val="Quote"/>
     <w:basedOn w:val="Normal"/>
     <w:next w:val="Normal"/>
-    <w:link w:val="CitaCar"/>
+    <w:link w:val="QuoteChar"/>
     <w:uiPriority w:val="29"/>
     <w:qFormat/>
     <w:rsid w:val="00F90F28"/>
@@ -8973,10 +10413,10 @@
       <w:color w:val="404040" w:themeColor="text1" w:themeTint="BF"/>
     </w:rPr>
   </w:style>
-  <w:style w:type="character" w:customStyle="1" w:styleId="CitaCar">
-    <w:name w:val="Cita Car"/>
-    <w:basedOn w:val="Fuentedeprrafopredeter"/>
-    <w:link w:val="Cita"/>
+  <w:style w:type="character" w:customStyle="1" w:styleId="QuoteChar">
+    <w:name w:val="Quote Char"/>
+    <w:basedOn w:val="DefaultParagraphFont"/>
+    <w:link w:val="Quote"/>
     <w:uiPriority w:val="29"/>
     <w:rsid w:val="00F90F28"/>
     <w:rPr>
@@ -8985,7 +10425,7 @@
       <w:color w:val="404040" w:themeColor="text1" w:themeTint="BF"/>
     </w:rPr>
   </w:style>
-  <w:style w:type="paragraph" w:styleId="Prrafodelista">
+  <w:style w:type="paragraph" w:styleId="ListParagraph">
     <w:name w:val="List Paragraph"/>
     <w:basedOn w:val="Normal"/>
     <w:uiPriority w:val="34"/>
@@ -8996,9 +10436,9 @@
       <w:contextualSpacing/>
     </w:pPr>
   </w:style>
-  <w:style w:type="character" w:styleId="nfasisintenso">
+  <w:style w:type="character" w:styleId="IntenseEmphasis">
     <w:name w:val="Intense Emphasis"/>
-    <w:basedOn w:val="Fuentedeprrafopredeter"/>
+    <w:basedOn w:val="DefaultParagraphFont"/>
     <w:uiPriority w:val="21"/>
     <w:qFormat/>
     <w:rsid w:val="00F90F28"/>
@@ -9008,11 +10448,11 @@
       <w:color w:val="0F4761" w:themeColor="accent1" w:themeShade="BF"/>
     </w:rPr>
   </w:style>
-  <w:style w:type="paragraph" w:styleId="Citadestacada">
+  <w:style w:type="paragraph" w:styleId="IntenseQuote">
     <w:name w:val="Intense Quote"/>
     <w:basedOn w:val="Normal"/>
     <w:next w:val="Normal"/>
-    <w:link w:val="CitadestacadaCar"/>
+    <w:link w:val="IntenseQuoteChar"/>
     <w:uiPriority w:val="30"/>
     <w:qFormat/>
     <w:rsid w:val="00F90F28"/>
@@ -9031,10 +10471,10 @@
       <w:color w:val="0F4761" w:themeColor="accent1" w:themeShade="BF"/>
     </w:rPr>
   </w:style>
-  <w:style w:type="character" w:customStyle="1" w:styleId="CitadestacadaCar">
-    <w:name w:val="Cita destacada Car"/>
-    <w:basedOn w:val="Fuentedeprrafopredeter"/>
-    <w:link w:val="Citadestacada"/>
+  <w:style w:type="character" w:customStyle="1" w:styleId="IntenseQuoteChar">
+    <w:name w:val="Intense Quote Char"/>
+    <w:basedOn w:val="DefaultParagraphFont"/>
+    <w:link w:val="IntenseQuote"/>
     <w:uiPriority w:val="30"/>
     <w:rsid w:val="00F90F28"/>
     <w:rPr>
@@ -9043,9 +10483,9 @@
       <w:color w:val="0F4761" w:themeColor="accent1" w:themeShade="BF"/>
     </w:rPr>
   </w:style>
-  <w:style w:type="character" w:styleId="Referenciaintensa">
+  <w:style w:type="character" w:styleId="IntenseReference">
     <w:name w:val="Intense Reference"/>
-    <w:basedOn w:val="Fuentedeprrafopredeter"/>
+    <w:basedOn w:val="DefaultParagraphFont"/>
     <w:uiPriority w:val="32"/>
     <w:qFormat/>
     <w:rsid w:val="00F90F28"/>
@@ -9057,9 +10497,9 @@
       <w:spacing w:val="5"/>
     </w:rPr>
   </w:style>
-  <w:style w:type="character" w:styleId="Hipervnculo">
+  <w:style w:type="character" w:styleId="Hyperlink">
     <w:name w:val="Hyperlink"/>
-    <w:basedOn w:val="Fuentedeprrafopredeter"/>
+    <w:basedOn w:val="DefaultParagraphFont"/>
     <w:uiPriority w:val="99"/>
     <w:unhideWhenUsed/>
     <w:rsid w:val="005E1EE9"/>
@@ -9068,9 +10508,9 @@
       <w:u w:val="single"/>
     </w:rPr>
   </w:style>
-  <w:style w:type="character" w:styleId="Mencinsinresolver">
+  <w:style w:type="character" w:styleId="UnresolvedMention">
     <w:name w:val="Unresolved Mention"/>
-    <w:basedOn w:val="Fuentedeprrafopredeter"/>
+    <w:basedOn w:val="DefaultParagraphFont"/>
     <w:uiPriority w:val="99"/>
     <w:semiHidden/>
     <w:unhideWhenUsed/>
@@ -9080,9 +10520,9 @@
       <w:shd w:val="clear" w:color="auto" w:fill="E1DFDD"/>
     </w:rPr>
   </w:style>
-  <w:style w:type="table" w:styleId="Tablaconcuadrcula">
+  <w:style w:type="table" w:styleId="TableGrid">
     <w:name w:val="Table Grid"/>
-    <w:basedOn w:val="Tablanormal"/>
+    <w:basedOn w:val="TableNormal"/>
     <w:uiPriority w:val="39"/>
     <w:rsid w:val="005E1EE9"/>
     <w:pPr>
@@ -9099,7 +10539,7 @@
       </w:tblBorders>
     </w:tblPr>
   </w:style>
-  <w:style w:type="paragraph" w:styleId="Descripcin">
+  <w:style w:type="paragraph" w:styleId="Caption">
     <w:name w:val="caption"/>
     <w:basedOn w:val="Normal"/>
     <w:next w:val="Normal"/>
@@ -9117,6 +10557,63 @@
       <w:sz w:val="18"/>
       <w:szCs w:val="18"/>
     </w:rPr>
+  </w:style>
+  <w:style w:type="table" w:styleId="GridTable1Light">
+    <w:name w:val="Grid Table 1 Light"/>
+    <w:basedOn w:val="TableNormal"/>
+    <w:uiPriority w:val="46"/>
+    <w:rsid w:val="00EA028A"/>
+    <w:pPr>
+      <w:spacing w:after="0" w:line="240" w:lineRule="auto"/>
+    </w:pPr>
+    <w:tblPr>
+      <w:tblStyleRowBandSize w:val="1"/>
+      <w:tblStyleColBandSize w:val="1"/>
+      <w:tblBorders>
+        <w:top w:val="single" w:sz="4" w:space="0" w:color="999999" w:themeColor="text1" w:themeTint="66"/>
+        <w:left w:val="single" w:sz="4" w:space="0" w:color="999999" w:themeColor="text1" w:themeTint="66"/>
+        <w:bottom w:val="single" w:sz="4" w:space="0" w:color="999999" w:themeColor="text1" w:themeTint="66"/>
+        <w:right w:val="single" w:sz="4" w:space="0" w:color="999999" w:themeColor="text1" w:themeTint="66"/>
+        <w:insideH w:val="single" w:sz="4" w:space="0" w:color="999999" w:themeColor="text1" w:themeTint="66"/>
+        <w:insideV w:val="single" w:sz="4" w:space="0" w:color="999999" w:themeColor="text1" w:themeTint="66"/>
+      </w:tblBorders>
+    </w:tblPr>
+    <w:tblStylePr w:type="firstRow">
+      <w:rPr>
+        <w:b/>
+        <w:bCs/>
+      </w:rPr>
+      <w:tblPr/>
+      <w:tcPr>
+        <w:tcBorders>
+          <w:bottom w:val="single" w:sz="12" w:space="0" w:color="666666" w:themeColor="text1" w:themeTint="99"/>
+        </w:tcBorders>
+      </w:tcPr>
+    </w:tblStylePr>
+    <w:tblStylePr w:type="lastRow">
+      <w:rPr>
+        <w:b/>
+        <w:bCs/>
+      </w:rPr>
+      <w:tblPr/>
+      <w:tcPr>
+        <w:tcBorders>
+          <w:top w:val="double" w:sz="2" w:space="0" w:color="666666" w:themeColor="text1" w:themeTint="99"/>
+        </w:tcBorders>
+      </w:tcPr>
+    </w:tblStylePr>
+    <w:tblStylePr w:type="firstCol">
+      <w:rPr>
+        <w:b/>
+        <w:bCs/>
+      </w:rPr>
+    </w:tblStylePr>
+    <w:tblStylePr w:type="lastCol">
+      <w:rPr>
+        <w:b/>
+        <w:bCs/>
+      </w:rPr>
+    </w:tblStylePr>
   </w:style>
 </w:styles>
 </file>

</xml_diff>